<commit_message>
Add nummeth toggle and dynamic UI flow
</commit_message>
<xml_diff>
--- a/bct_info/Cover_template.docx
+++ b/bct_info/Cover_template.docx
@@ -7,6 +7,29 @@
         <w:pStyle w:val="Normal"/>
         <w:jc w:val="center"/>
         <w:rPr>
+          <w:rFonts w:ascii="Times New Roman" w:hAnsi="Times New Roman" w:cs="Times New Roman"/>
+          <w:b/>
+          <w:bCs/>
+          <w:sz w:val="44"/>
+          <w:szCs w:val="44"/>
+        </w:rPr>
+      </w:pPr>
+      <w:r>
+        <w:rPr>
+          <w:rFonts w:cs="Times New Roman" w:ascii="Times New Roman" w:hAnsi="Times New Roman"/>
+          <w:b/>
+          <w:bCs/>
+          <w:sz w:val="44"/>
+          <w:szCs w:val="44"/>
+        </w:rPr>
+      </w:r>
+    </w:p>
+    <w:p>
+      <w:pPr>
+        <w:pStyle w:val="Normal"/>
+        <w:spacing w:before="0" w:after="144"/>
+        <w:jc w:val="center"/>
+        <w:rPr>
           <w:sz w:val="40"/>
           <w:szCs w:val="40"/>
         </w:rPr>
@@ -25,6 +48,7 @@
     <w:p>
       <w:pPr>
         <w:pStyle w:val="Normal"/>
+        <w:spacing w:before="0" w:after="144"/>
         <w:jc w:val="center"/>
         <w:rPr>
           <w:sz w:val="40"/>
@@ -49,26 +73,30 @@
           <w:tab w:val="clear" w:pos="720"/>
           <w:tab w:val="left" w:pos="9360" w:leader="none"/>
         </w:tabs>
+        <w:spacing w:before="0" w:after="144"/>
         <w:jc w:val="center"/>
         <w:rPr>
+          <w:rFonts w:ascii="Times New Roman" w:hAnsi="Times New Roman" w:cs="Times New Roman"/>
+          <w:b/>
+          <w:bCs/>
           <w:sz w:val="40"/>
           <w:szCs w:val="40"/>
         </w:rPr>
       </w:pPr>
       <w:r>
         <w:drawing>
-          <wp:anchor distT="0" distB="0" distL="114300" distR="114300" simplePos="0" relativeHeight="2" behindDoc="0" locked="0" layoutInCell="0" allowOverlap="1">
+          <wp:anchor distT="0" distB="0" distL="114300" distR="114300" simplePos="0" relativeHeight="3" behindDoc="0" locked="0" layoutInCell="0" allowOverlap="1">
             <wp:simplePos x="0" y="0"/>
             <wp:positionH relativeFrom="margin">
-              <wp:posOffset>2477135</wp:posOffset>
+              <wp:posOffset>2532380</wp:posOffset>
             </wp:positionH>
             <wp:positionV relativeFrom="paragraph">
-              <wp:posOffset>619125</wp:posOffset>
+              <wp:posOffset>487045</wp:posOffset>
             </wp:positionV>
-            <wp:extent cx="1373505" cy="1571625"/>
+            <wp:extent cx="1554480" cy="1755775"/>
             <wp:effectExtent l="0" t="0" r="0" b="0"/>
             <wp:wrapTopAndBottom/>
-            <wp:docPr id="1" name="Picture 1"/>
+            <wp:docPr id="1" name="Picture 5"/>
             <wp:cNvGraphicFramePr>
               <a:graphicFrameLocks xmlns:a="http://schemas.openxmlformats.org/drawingml/2006/main" noChangeAspect="1"/>
             </wp:cNvGraphicFramePr>
@@ -76,7 +104,7 @@
               <a:graphicData uri="http://schemas.openxmlformats.org/drawingml/2006/picture">
                 <pic:pic xmlns:pic="http://schemas.openxmlformats.org/drawingml/2006/picture">
                   <pic:nvPicPr>
-                    <pic:cNvPr id="1" name="Picture 1"/>
+                    <pic:cNvPr id="1" name="Picture 5"/>
                     <pic:cNvPicPr>
                       <a:picLocks noChangeAspect="1" noChangeArrowheads="1"/>
                     </pic:cNvPicPr>
@@ -90,7 +118,7 @@
                   <pic:spPr bwMode="auto">
                     <a:xfrm>
                       <a:off x="0" y="0"/>
-                      <a:ext cx="1373505" cy="1571625"/>
+                      <a:ext cx="1554480" cy="1755775"/>
                     </a:xfrm>
                     <a:prstGeom prst="rect">
                       <a:avLst/>
@@ -102,21 +130,50 @@
             </a:graphic>
           </wp:anchor>
         </w:drawing>
+      </w:r>
+      <w:r>
+        <w:rPr>
+          <w:rFonts w:cs="Times New Roman" w:ascii="Times New Roman" w:hAnsi="Times New Roman"/>
+          <w:b/>
+          <w:bCs/>
+          <w:sz w:val="40"/>
+          <w:szCs w:val="40"/>
+        </w:rPr>
+        <w:t>THAPATHALI CAMPUS</w:t>
+      </w:r>
+    </w:p>
+    <w:p>
+      <w:pPr>
+        <w:pStyle w:val="Normal"/>
+        <w:tabs>
+          <w:tab w:val="clear" w:pos="720"/>
+          <w:tab w:val="left" w:pos="9360" w:leader="none"/>
+        </w:tabs>
+        <w:jc w:val="center"/>
+        <w:rPr>
+          <w:rFonts w:ascii="Times New Roman" w:hAnsi="Times New Roman" w:cs="Times New Roman"/>
+          <w:b/>
+          <w:bCs/>
+          <w:sz w:val="28"/>
+          <w:szCs w:val="28"/>
+        </w:rPr>
+      </w:pPr>
+      <w:r>
         <mc:AlternateContent>
           <mc:Choice Requires="wpg">
             <w:drawing>
-              <wp:anchor distT="635" distB="29210" distL="104140" distR="127635" simplePos="0" relativeHeight="3" behindDoc="0" locked="0" layoutInCell="0" allowOverlap="1" wp14:anchorId="3A58B2EB">
+              <wp:anchor distT="960755" distB="997585" distL="0" distR="0" simplePos="0" relativeHeight="2" behindDoc="0" locked="0" layoutInCell="0" allowOverlap="1" wp14:anchorId="538DC8F3">
                 <wp:simplePos x="0" y="0"/>
-                <wp:positionH relativeFrom="margin">
-                  <wp:posOffset>2867660</wp:posOffset>
+                <wp:positionH relativeFrom="column">
+                  <wp:align>center</wp:align>
                 </wp:positionH>
                 <wp:positionV relativeFrom="paragraph">
-                  <wp:posOffset>2333625</wp:posOffset>
+                  <wp:posOffset>2038985</wp:posOffset>
                 </wp:positionV>
-                <wp:extent cx="586105" cy="2065655"/>
-                <wp:effectExtent l="10160" t="635" r="9525" b="635"/>
+                <wp:extent cx="457200" cy="1965960"/>
+                <wp:effectExtent l="0" t="635" r="0" b="0"/>
                 <wp:wrapTopAndBottom/>
-                <wp:docPr id="2" name="Group 10"/>
+                <wp:docPr id="2" name="Group 4"/>
                 <a:graphic xmlns:a="http://schemas.openxmlformats.org/drawingml/2006/main">
                   <a:graphicData uri="http://schemas.microsoft.com/office/word/2010/wordprocessingGroup">
                     <wpg:wgp>
@@ -124,91 +181,82 @@
                       <wpg:grpSpPr>
                         <a:xfrm>
                           <a:off x="0" y="0"/>
-                          <a:ext cx="586080" cy="2065680"/>
+                          <a:ext cx="457200" cy="1965960"/>
                           <a:chOff x="0" y="0"/>
-                          <a:chExt cx="586080" cy="2065680"/>
+                          <a:chExt cx="457200" cy="1965960"/>
                         </a:xfrm>
                       </wpg:grpSpPr>
-                      <wpg:grpSp>
-                        <wpg:cNvGrpSpPr/>
-                        <wpg:grpSpPr>
-                          <a:xfrm>
-                            <a:off x="0" y="0"/>
-                            <a:ext cx="304920" cy="2065680"/>
-                          </a:xfrm>
-                        </wpg:grpSpPr>
-                        <wps:wsp>
-                          <wps:cNvSpPr/>
-                          <wps:spPr>
-                            <a:xfrm>
-                              <a:off x="303480" y="0"/>
-                              <a:ext cx="1440" cy="2065680"/>
-                            </a:xfrm>
-                            <a:prstGeom prst="line">
-                              <a:avLst/>
-                            </a:prstGeom>
-                            <a:ln w="19050">
-                              <a:solidFill>
-                                <a:srgbClr val="000000"/>
-                              </a:solidFill>
-                            </a:ln>
-                          </wps:spPr>
-                          <wps:style>
-                            <a:lnRef idx="1">
-                              <a:schemeClr val="dk1"/>
-                            </a:lnRef>
-                            <a:fillRef idx="0">
-                              <a:schemeClr val="dk1"/>
-                            </a:fillRef>
-                            <a:effectRef idx="0">
-                              <a:schemeClr val="dk1"/>
-                            </a:effectRef>
-                            <a:fontRef idx="minor"/>
-                          </wps:style>
-                          <wps:bodyPr/>
-                        </wps:wsp>
-                        <wps:wsp>
-                          <wps:cNvSpPr/>
-                          <wps:spPr>
-                            <a:xfrm>
-                              <a:off x="0" y="460440"/>
-                              <a:ext cx="720" cy="1252080"/>
-                            </a:xfrm>
-                            <a:prstGeom prst="line">
-                              <a:avLst/>
-                            </a:prstGeom>
-                            <a:ln w="19050">
-                              <a:solidFill>
-                                <a:srgbClr val="000000"/>
-                              </a:solidFill>
-                            </a:ln>
-                          </wps:spPr>
-                          <wps:style>
-                            <a:lnRef idx="1">
-                              <a:schemeClr val="dk1"/>
-                            </a:lnRef>
-                            <a:fillRef idx="0">
-                              <a:schemeClr val="dk1"/>
-                            </a:fillRef>
-                            <a:effectRef idx="0">
-                              <a:schemeClr val="dk1"/>
-                            </a:effectRef>
-                            <a:fontRef idx="minor"/>
-                          </wps:style>
-                          <wps:bodyPr/>
-                        </wps:wsp>
-                      </wpg:grpSp>
                       <wps:wsp>
                         <wps:cNvSpPr/>
                         <wps:spPr>
-                          <a:xfrm>
-                            <a:off x="585000" y="450720"/>
-                            <a:ext cx="1440" cy="1251720"/>
+                          <a:xfrm flipH="1" flipV="1">
+                            <a:off x="228600" y="0"/>
+                            <a:ext cx="720" cy="1965960"/>
                           </a:xfrm>
                           <a:prstGeom prst="line">
                             <a:avLst/>
                           </a:prstGeom>
-                          <a:ln w="19050">
+                          <a:ln w="28575">
+                            <a:solidFill>
+                              <a:srgbClr val="000000"/>
+                            </a:solidFill>
+                          </a:ln>
+                        </wps:spPr>
+                        <wps:style>
+                          <a:lnRef idx="1">
+                            <a:schemeClr val="dk1"/>
+                          </a:lnRef>
+                          <a:fillRef idx="0">
+                            <a:schemeClr val="dk1"/>
+                          </a:fillRef>
+                          <a:effectRef idx="0">
+                            <a:schemeClr val="dk1"/>
+                          </a:effectRef>
+                          <a:fontRef idx="minor"/>
+                        </wps:style>
+                        <wps:bodyPr/>
+                      </wps:wsp>
+                      <wps:wsp>
+                        <wps:cNvSpPr/>
+                        <wps:spPr>
+                          <a:xfrm flipH="1" flipV="1">
+                            <a:off x="456480" y="387360"/>
+                            <a:ext cx="720" cy="1191960"/>
+                          </a:xfrm>
+                          <a:prstGeom prst="line">
+                            <a:avLst/>
+                          </a:prstGeom>
+                          <a:ln w="28575">
+                            <a:solidFill>
+                              <a:srgbClr val="000000"/>
+                            </a:solidFill>
+                          </a:ln>
+                        </wps:spPr>
+                        <wps:style>
+                          <a:lnRef idx="1">
+                            <a:schemeClr val="dk1"/>
+                          </a:lnRef>
+                          <a:fillRef idx="0">
+                            <a:schemeClr val="dk1"/>
+                          </a:fillRef>
+                          <a:effectRef idx="0">
+                            <a:schemeClr val="dk1"/>
+                          </a:effectRef>
+                          <a:fontRef idx="minor"/>
+                        </wps:style>
+                        <wps:bodyPr/>
+                      </wps:wsp>
+                      <wps:wsp>
+                        <wps:cNvSpPr/>
+                        <wps:spPr>
+                          <a:xfrm flipH="1" flipV="1">
+                            <a:off x="0" y="387360"/>
+                            <a:ext cx="720" cy="1191960"/>
+                          </a:xfrm>
+                          <a:prstGeom prst="line">
+                            <a:avLst/>
+                          </a:prstGeom>
+                          <a:ln w="28575">
                             <a:solidFill>
                               <a:srgbClr val="000000"/>
                             </a:solidFill>
@@ -236,21 +284,19 @@
           </mc:Choice>
           <mc:Fallback>
             <w:pict>
-              <v:group id="shape_0" alt="Group 10" style="position:absolute;margin-left:225.8pt;margin-top:183.75pt;width:46.1pt;height:162.6pt" coordorigin="4516,3675" coordsize="922,3252">
-                <v:group id="shape_0" style="position:absolute;left:4516;top:3675;width:479;height:3252">
-                  <v:line id="shape_0" from="4994,3675" to="4995,6927" stroked="t" o:allowincell="f" style="position:absolute;mso-position-horizontal-relative:margin">
-                    <v:stroke color="black" weight="19080" joinstyle="miter" endcap="flat"/>
-                    <v:fill o:detectmouseclick="t" on="false"/>
-                    <w10:wrap type="topAndBottom"/>
-                  </v:line>
-                  <v:line id="shape_0" from="4516,4400" to="4516,6371" stroked="t" o:allowincell="f" style="position:absolute;mso-position-horizontal-relative:margin">
-                    <v:stroke color="black" weight="19080" joinstyle="miter" endcap="flat"/>
-                    <v:fill o:detectmouseclick="t" on="false"/>
-                    <w10:wrap type="topAndBottom"/>
-                  </v:line>
-                </v:group>
-                <v:line id="shape_0" from="5437,4385" to="5438,6355" stroked="t" o:allowincell="f" style="position:absolute;mso-position-horizontal-relative:margin">
-                  <v:stroke color="black" weight="19080" joinstyle="miter" endcap="flat"/>
+              <v:group id="shape_0" alt="Group 4" style="position:absolute;margin-left:243.65pt;margin-top:160.55pt;width:35.9pt;height:154.75pt" coordorigin="4873,3211" coordsize="718,3095">
+                <v:line id="shape_0" from="5233,3211" to="5233,6306" stroked="t" o:allowincell="f" style="position:absolute;flip:xy;mso-position-horizontal:center">
+                  <v:stroke color="black" weight="28440" joinstyle="miter" endcap="flat"/>
+                  <v:fill o:detectmouseclick="t" on="false"/>
+                  <w10:wrap type="topAndBottom"/>
+                </v:line>
+                <v:line id="shape_0" from="5592,3821" to="5592,5697" stroked="t" o:allowincell="f" style="position:absolute;flip:xy;mso-position-horizontal:center">
+                  <v:stroke color="black" weight="28440" joinstyle="miter" endcap="flat"/>
+                  <v:fill o:detectmouseclick="t" on="false"/>
+                  <w10:wrap type="topAndBottom"/>
+                </v:line>
+                <v:line id="shape_0" from="4873,3821" to="4873,5697" stroked="t" o:allowincell="f" style="position:absolute;flip:xy;mso-position-horizontal:center">
+                  <v:stroke color="black" weight="28440" joinstyle="miter" endcap="flat"/>
                   <v:fill o:detectmouseclick="t" on="false"/>
                   <w10:wrap type="topAndBottom"/>
                 </v:line>
@@ -264,51 +310,8 @@
           <w:rFonts w:cs="Times New Roman" w:ascii="Times New Roman" w:hAnsi="Times New Roman"/>
           <w:b/>
           <w:bCs/>
-          <w:sz w:val="40"/>
-          <w:szCs w:val="40"/>
-        </w:rPr>
-        <w:t>THAPATHALI CAMPUS</w:t>
-      </w:r>
-    </w:p>
-    <w:p>
-      <w:pPr>
-        <w:pStyle w:val="Normal"/>
-        <w:jc w:val="center"/>
-        <w:rPr>
-          <w:rFonts w:ascii="Times New Roman" w:hAnsi="Times New Roman" w:cs="Times New Roman"/>
-          <w:b/>
-          <w:bCs/>
-          <w:sz w:val="48"/>
-          <w:szCs w:val="48"/>
-        </w:rPr>
-      </w:pPr>
-      <w:r>
-        <w:rPr>
-          <w:rFonts w:cs="Times New Roman" w:ascii="Times New Roman" w:hAnsi="Times New Roman"/>
-          <w:b/>
-          <w:bCs/>
-          <w:sz w:val="48"/>
-          <w:szCs w:val="48"/>
-        </w:rPr>
-        <w:t xml:space="preserve"> </w:t>
-      </w:r>
-    </w:p>
-    <w:p>
-      <w:pPr>
-        <w:pStyle w:val="Normal"/>
-        <w:jc w:val="center"/>
-        <w:rPr>
-          <w:sz w:val="26"/>
-          <w:szCs w:val="26"/>
-        </w:rPr>
-      </w:pPr>
-      <w:r>
-        <w:rPr>
-          <w:rFonts w:cs="Times New Roman" w:ascii="Times New Roman" w:hAnsi="Times New Roman"/>
-          <w:b/>
-          <w:bCs/>
-          <w:sz w:val="26"/>
-          <w:szCs w:val="26"/>
+          <w:sz w:val="28"/>
+          <w:szCs w:val="28"/>
         </w:rPr>
         <w:t>Lab Report No: …….</w:t>
       </w:r>
@@ -316,10 +319,11 @@
     <w:p>
       <w:pPr>
         <w:pStyle w:val="Normal"/>
+        <w:spacing w:before="432" w:after="144"/>
         <w:jc w:val="center"/>
         <w:rPr>
-          <w:sz w:val="26"/>
-          <w:szCs w:val="26"/>
+          <w:sz w:val="28"/>
+          <w:szCs w:val="28"/>
         </w:rPr>
       </w:pPr>
       <w:r>
@@ -327,8 +331,8 @@
           <w:rFonts w:cs="Times New Roman" w:ascii="Times New Roman" w:hAnsi="Times New Roman"/>
           <w:b/>
           <w:bCs/>
-          <w:sz w:val="26"/>
-          <w:szCs w:val="26"/>
+          <w:sz w:val="28"/>
+          <w:szCs w:val="28"/>
         </w:rPr>
         <w:t>A Report on: ………………………………………….</w:t>
       </w:r>
@@ -338,8 +342,8 @@
         <w:pStyle w:val="Normal"/>
         <w:jc w:val="center"/>
         <w:rPr>
-          <w:sz w:val="26"/>
-          <w:szCs w:val="26"/>
+          <w:sz w:val="28"/>
+          <w:szCs w:val="28"/>
         </w:rPr>
       </w:pPr>
       <w:r>
@@ -347,8 +351,8 @@
           <w:rFonts w:cs="Times New Roman" w:ascii="Times New Roman" w:hAnsi="Times New Roman"/>
           <w:b/>
           <w:bCs/>
-          <w:sz w:val="26"/>
-          <w:szCs w:val="26"/>
+          <w:sz w:val="28"/>
+          <w:szCs w:val="28"/>
         </w:rPr>
         <w:t>…………………………………………………………</w:t>
       </w:r>
@@ -361,8 +365,8 @@
           <w:rFonts w:ascii="Times New Roman" w:hAnsi="Times New Roman" w:cs="Times New Roman"/>
           <w:b/>
           <w:bCs/>
-          <w:sz w:val="26"/>
-          <w:szCs w:val="26"/>
+          <w:sz w:val="28"/>
+          <w:szCs w:val="28"/>
         </w:rPr>
       </w:pPr>
       <w:r>
@@ -370,8 +374,8 @@
           <w:rFonts w:cs="Times New Roman" w:ascii="Times New Roman" w:hAnsi="Times New Roman"/>
           <w:b/>
           <w:bCs/>
-          <w:sz w:val="26"/>
-          <w:szCs w:val="26"/>
+          <w:sz w:val="28"/>
+          <w:szCs w:val="28"/>
         </w:rPr>
       </w:r>
     </w:p>
@@ -383,8 +387,8 @@
           <w:tab w:val="right" w:pos="10206" w:leader="none"/>
         </w:tabs>
         <w:rPr>
-          <w:sz w:val="26"/>
-          <w:szCs w:val="26"/>
+          <w:sz w:val="28"/>
+          <w:szCs w:val="28"/>
         </w:rPr>
       </w:pPr>
       <w:r>
@@ -392,8 +396,8 @@
           <w:rFonts w:cs="Times New Roman" w:ascii="Times New Roman" w:hAnsi="Times New Roman"/>
           <w:b/>
           <w:bCs/>
-          <w:sz w:val="26"/>
-          <w:szCs w:val="26"/>
+          <w:sz w:val="28"/>
+          <w:szCs w:val="28"/>
         </w:rPr>
         <w:t>Submitted By:</w:t>
         <w:tab/>
@@ -408,8 +412,8 @@
           <w:tab w:val="right" w:pos="10206" w:leader="none"/>
         </w:tabs>
         <w:rPr>
-          <w:sz w:val="26"/>
-          <w:szCs w:val="26"/>
+          <w:sz w:val="28"/>
+          <w:szCs w:val="28"/>
         </w:rPr>
       </w:pPr>
       <w:r>
@@ -417,8 +421,8 @@
           <w:rFonts w:cs="Times New Roman" w:ascii="Times New Roman" w:hAnsi="Times New Roman"/>
           <w:b/>
           <w:bCs/>
-          <w:sz w:val="26"/>
-          <w:szCs w:val="26"/>
+          <w:sz w:val="28"/>
+          <w:szCs w:val="28"/>
         </w:rPr>
         <w:t>Name: {{student_name}}</w:t>
         <w:tab/>
@@ -433,8 +437,8 @@
           <w:tab w:val="right" w:pos="10206" w:leader="none"/>
         </w:tabs>
         <w:rPr>
-          <w:sz w:val="26"/>
-          <w:szCs w:val="26"/>
+          <w:sz w:val="28"/>
+          <w:szCs w:val="28"/>
         </w:rPr>
       </w:pPr>
       <w:r>
@@ -442,10 +446,10 @@
           <w:rFonts w:cs="Times New Roman" w:ascii="Times New Roman" w:hAnsi="Times New Roman"/>
           <w:b/>
           <w:bCs/>
-          <w:sz w:val="26"/>
-          <w:szCs w:val="26"/>
-        </w:rPr>
-        <w:t>Roll No: {{roll_no}}</w:t>
+          <w:sz w:val="28"/>
+          <w:szCs w:val="28"/>
+        </w:rPr>
+        <w:t>Roll No: {{roll_num}}</w:t>
         <w:tab/>
         <w:t>Computer and</w:t>
       </w:r>
@@ -459,11 +463,8 @@
         </w:tabs>
         <w:spacing w:before="0" w:after="160"/>
         <w:rPr>
-          <w:rFonts w:ascii="Times New Roman" w:hAnsi="Times New Roman" w:cs="Times New Roman"/>
-          <w:b/>
-          <w:bCs/>
-          <w:sz w:val="26"/>
-          <w:szCs w:val="26"/>
+          <w:sz w:val="28"/>
+          <w:szCs w:val="28"/>
         </w:rPr>
       </w:pPr>
       <w:r>
@@ -471,8 +472,8 @@
           <w:rFonts w:cs="Times New Roman" w:ascii="Times New Roman" w:hAnsi="Times New Roman"/>
           <w:b/>
           <w:bCs/>
-          <w:sz w:val="26"/>
-          <w:szCs w:val="26"/>
+          <w:sz w:val="28"/>
+          <w:szCs w:val="28"/>
         </w:rPr>
         <w:t>Submission Date: ……………………</w:t>
         <w:tab/>
@@ -481,13 +482,13 @@
     </w:p>
     <w:sectPr>
       <w:type w:val="nextPage"/>
-      <w:pgSz w:w="12240" w:h="15840"/>
-      <w:pgMar w:left="1138" w:right="1138" w:gutter="0" w:header="0" w:top="1134" w:footer="0" w:bottom="562"/>
-      <w:pgBorders w:display="allPages" w:offsetFrom="page">
-        <w:top w:val="thinThickSmallGap" w:sz="12" w:space="30" w:color="000000"/>
-        <w:left w:val="thinThickSmallGap" w:sz="12" w:space="30" w:color="000000"/>
-        <w:bottom w:val="thickThinSmallGap" w:sz="12" w:space="30" w:color="000000"/>
-        <w:right w:val="thickThinSmallGap" w:sz="12" w:space="30" w:color="000000"/>
+      <w:pgSz w:w="11906" w:h="16838"/>
+      <w:pgMar w:left="720" w:right="720" w:gutter="0" w:header="0" w:top="720" w:footer="0" w:bottom="720"/>
+      <w:pgBorders w:display="allPages" w:offsetFrom="text">
+        <w:top w:val="thinThickSmallGap" w:sz="12" w:space="3" w:color="000000"/>
+        <w:left w:val="thinThickSmallGap" w:sz="12" w:space="3" w:color="000000"/>
+        <w:bottom w:val="thickThinSmallGap" w:sz="12" w:space="3" w:color="000000"/>
+        <w:right w:val="thickThinSmallGap" w:sz="12" w:space="3" w:color="000000"/>
       </w:pgBorders>
       <w:pgNumType w:fmt="decimal"/>
       <w:formProt w:val="false"/>
@@ -1342,7 +1343,7 @@
       <w:spacing w:before="240" w:after="120"/>
     </w:pPr>
     <w:rPr>
-      <w:rFonts w:ascii="Liberation Sans" w:hAnsi="Liberation Sans" w:eastAsia="Noto Sans CJK SC" w:cs="Noto Sans Devanagari"/>
+      <w:rFonts w:ascii="Liberation Sans" w:hAnsi="Liberation Sans" w:eastAsia="PingFang SC" w:cs="Arial Unicode MS"/>
       <w:sz w:val="28"/>
       <w:szCs w:val="28"/>
     </w:rPr>
@@ -1360,7 +1361,7 @@
     <w:basedOn w:val="BodyText"/>
     <w:pPr/>
     <w:rPr>
-      <w:rFonts w:cs="Noto Sans Devanagari"/>
+      <w:rFonts w:cs="Arial Unicode MS"/>
     </w:rPr>
   </w:style>
   <w:style w:type="paragraph" w:styleId="Caption">
@@ -1372,7 +1373,7 @@
       <w:spacing w:before="120" w:after="120"/>
     </w:pPr>
     <w:rPr>
-      <w:rFonts w:cs="Noto Sans Devanagari"/>
+      <w:rFonts w:cs="Arial Unicode MS"/>
       <w:i/>
       <w:iCs/>
       <w:sz w:val="24"/>
@@ -1387,7 +1388,7 @@
       <w:suppressLineNumbers/>
     </w:pPr>
     <w:rPr>
-      <w:rFonts w:cs="Noto Sans Devanagari"/>
+      <w:rFonts w:cs="Arial Unicode MS"/>
     </w:rPr>
   </w:style>
   <w:style w:type="paragraph" w:styleId="Title">

</xml_diff>

<commit_message>
feat: update UI and nummeth cover generation flow
</commit_message>
<xml_diff>
--- a/bct_info/Cover_template.docx
+++ b/bct_info/Cover_template.docx
@@ -1,10 +1,9 @@
 
 <file path=word/document.xml><?xml version="1.0" encoding="utf-8"?>
-<w:document xmlns:o="urn:schemas-microsoft-com:office:office" xmlns:r="http://schemas.openxmlformats.org/officeDocument/2006/relationships" xmlns:v="urn:schemas-microsoft-com:vml" xmlns:w="http://schemas.openxmlformats.org/wordprocessingml/2006/main" xmlns:w10="urn:schemas-microsoft-com:office:word" xmlns:wp="http://schemas.openxmlformats.org/drawingml/2006/wordprocessingDrawing" xmlns:pic="http://schemas.openxmlformats.org/drawingml/2006/picture" xmlns:wps="http://schemas.microsoft.com/office/word/2010/wordprocessingShape" xmlns:wpg="http://schemas.microsoft.com/office/word/2010/wordprocessingGroup" xmlns:mc="http://schemas.openxmlformats.org/markup-compatibility/2006" xmlns:wp14="http://schemas.microsoft.com/office/word/2010/wordprocessingDrawing" xmlns:w14="http://schemas.microsoft.com/office/word/2010/wordml" xmlns:w15="http://schemas.microsoft.com/office/word/2012/wordml" mc:Ignorable="w14 wp14 w15">
+<w:document xmlns:wpc="http://schemas.microsoft.com/office/word/2010/wordprocessingCanvas" xmlns:cx="http://schemas.microsoft.com/office/drawing/2014/chartex" xmlns:cx1="http://schemas.microsoft.com/office/drawing/2015/9/8/chartex" xmlns:cx2="http://schemas.microsoft.com/office/drawing/2015/10/21/chartex" xmlns:cx3="http://schemas.microsoft.com/office/drawing/2016/5/9/chartex" xmlns:cx4="http://schemas.microsoft.com/office/drawing/2016/5/10/chartex" xmlns:cx5="http://schemas.microsoft.com/office/drawing/2016/5/11/chartex" xmlns:cx6="http://schemas.microsoft.com/office/drawing/2016/5/12/chartex" xmlns:cx7="http://schemas.microsoft.com/office/drawing/2016/5/13/chartex" xmlns:cx8="http://schemas.microsoft.com/office/drawing/2016/5/14/chartex" xmlns:mc="http://schemas.openxmlformats.org/markup-compatibility/2006" xmlns:aink="http://schemas.microsoft.com/office/drawing/2016/ink" xmlns:am3d="http://schemas.microsoft.com/office/drawing/2017/model3d" xmlns:o="urn:schemas-microsoft-com:office:office" xmlns:r="http://schemas.openxmlformats.org/officeDocument/2006/relationships" xmlns:m="http://schemas.openxmlformats.org/officeDocument/2006/math" xmlns:v="urn:schemas-microsoft-com:vml" xmlns:wp14="http://schemas.microsoft.com/office/word/2010/wordprocessingDrawing" xmlns:wp="http://schemas.openxmlformats.org/drawingml/2006/wordprocessingDrawing" xmlns:w10="urn:schemas-microsoft-com:office:word" xmlns:w="http://schemas.openxmlformats.org/wordprocessingml/2006/main" xmlns:w14="http://schemas.microsoft.com/office/word/2010/wordml" xmlns:w15="http://schemas.microsoft.com/office/word/2012/wordml" xmlns:w16cex="http://schemas.microsoft.com/office/word/2018/wordml/cex" xmlns:w16cid="http://schemas.microsoft.com/office/word/2016/wordml/cid" xmlns:w16="http://schemas.microsoft.com/office/word/2018/wordml" xmlns:w16sdtdh="http://schemas.microsoft.com/office/word/2020/wordml/sdtdatahash" xmlns:w16se="http://schemas.microsoft.com/office/word/2015/wordml/symex" xmlns:wpg="http://schemas.microsoft.com/office/word/2010/wordprocessingGroup" xmlns:wpi="http://schemas.microsoft.com/office/word/2010/wordprocessingInk" xmlns:wne="http://schemas.microsoft.com/office/word/2006/wordml" xmlns:wps="http://schemas.microsoft.com/office/word/2010/wordprocessingShape" mc:Ignorable="w14 w15 w16se w16cid w16 w16cex w16sdtdh wp14">
   <w:body>
     <w:p>
       <w:pPr>
-        <w:pStyle w:val="Normal"/>
         <w:jc w:val="center"/>
         <w:rPr>
           <w:rFonts w:ascii="Times New Roman" w:hAnsi="Times New Roman" w:cs="Times New Roman"/>
@@ -14,20 +13,10 @@
           <w:szCs w:val="44"/>
         </w:rPr>
       </w:pPr>
-      <w:r>
-        <w:rPr>
-          <w:rFonts w:cs="Times New Roman" w:ascii="Times New Roman" w:hAnsi="Times New Roman"/>
-          <w:b/>
-          <w:bCs/>
-          <w:sz w:val="44"/>
-          <w:szCs w:val="44"/>
-        </w:rPr>
-      </w:r>
     </w:p>
     <w:p>
       <w:pPr>
-        <w:pStyle w:val="Normal"/>
-        <w:spacing w:before="0" w:after="144"/>
+        <w:spacing w:after="144"/>
         <w:jc w:val="center"/>
         <w:rPr>
           <w:sz w:val="40"/>
@@ -36,7 +25,7 @@
       </w:pPr>
       <w:r>
         <w:rPr>
-          <w:rFonts w:cs="Times New Roman" w:ascii="Times New Roman" w:hAnsi="Times New Roman"/>
+          <w:rFonts w:ascii="Times New Roman" w:hAnsi="Times New Roman" w:cs="Times New Roman"/>
           <w:b/>
           <w:bCs/>
           <w:sz w:val="40"/>
@@ -47,8 +36,7 @@
     </w:p>
     <w:p>
       <w:pPr>
-        <w:pStyle w:val="Normal"/>
-        <w:spacing w:before="0" w:after="144"/>
+        <w:spacing w:after="144"/>
         <w:jc w:val="center"/>
         <w:rPr>
           <w:sz w:val="40"/>
@@ -57,7 +45,7 @@
       </w:pPr>
       <w:r>
         <w:rPr>
-          <w:rFonts w:cs="Times New Roman" w:ascii="Times New Roman" w:hAnsi="Times New Roman"/>
+          <w:rFonts w:ascii="Times New Roman" w:hAnsi="Times New Roman" w:cs="Times New Roman"/>
           <w:b/>
           <w:bCs/>
           <w:sz w:val="40"/>
@@ -68,12 +56,10 @@
     </w:p>
     <w:p>
       <w:pPr>
-        <w:pStyle w:val="Normal"/>
         <w:tabs>
-          <w:tab w:val="clear" w:pos="720"/>
-          <w:tab w:val="left" w:pos="9360" w:leader="none"/>
+          <w:tab w:val="left" w:pos="9360"/>
         </w:tabs>
-        <w:spacing w:before="0" w:after="144"/>
+        <w:spacing w:after="144"/>
         <w:jc w:val="center"/>
         <w:rPr>
           <w:rFonts w:ascii="Times New Roman" w:hAnsi="Times New Roman" w:cs="Times New Roman"/>
@@ -84,8 +70,11 @@
         </w:rPr>
       </w:pPr>
       <w:r>
+        <w:rPr>
+          <w:noProof/>
+        </w:rPr>
         <w:drawing>
-          <wp:anchor distT="0" distB="0" distL="114300" distR="114300" simplePos="0" relativeHeight="3" behindDoc="0" locked="0" layoutInCell="0" allowOverlap="1">
+          <wp:anchor distT="0" distB="0" distL="114300" distR="114300" simplePos="0" relativeHeight="3" behindDoc="0" locked="0" layoutInCell="0" allowOverlap="1" wp14:anchorId="51C73826" wp14:editId="62C1F4E0">
             <wp:simplePos x="0" y="0"/>
             <wp:positionH relativeFrom="margin">
               <wp:posOffset>2532380</wp:posOffset>
@@ -110,7 +99,7 @@
                     </pic:cNvPicPr>
                   </pic:nvPicPr>
                   <pic:blipFill>
-                    <a:blip r:embed="rId2"/>
+                    <a:blip r:embed="rId5"/>
                     <a:stretch>
                       <a:fillRect/>
                     </a:stretch>
@@ -133,7 +122,7 @@
       </w:r>
       <w:r>
         <w:rPr>
-          <w:rFonts w:cs="Times New Roman" w:ascii="Times New Roman" w:hAnsi="Times New Roman"/>
+          <w:rFonts w:ascii="Times New Roman" w:hAnsi="Times New Roman" w:cs="Times New Roman"/>
           <w:b/>
           <w:bCs/>
           <w:sz w:val="40"/>
@@ -144,10 +133,8 @@
     </w:p>
     <w:p>
       <w:pPr>
-        <w:pStyle w:val="Normal"/>
         <w:tabs>
-          <w:tab w:val="clear" w:pos="720"/>
-          <w:tab w:val="left" w:pos="9360" w:leader="none"/>
+          <w:tab w:val="left" w:pos="9360"/>
         </w:tabs>
         <w:jc w:val="center"/>
         <w:rPr>
@@ -159,10 +146,13 @@
         </w:rPr>
       </w:pPr>
       <w:r>
+        <w:rPr>
+          <w:noProof/>
+        </w:rPr>
         <mc:AlternateContent>
           <mc:Choice Requires="wpg">
             <w:drawing>
-              <wp:anchor distT="960755" distB="997585" distL="0" distR="0" simplePos="0" relativeHeight="2" behindDoc="0" locked="0" layoutInCell="0" allowOverlap="1" wp14:anchorId="538DC8F3">
+              <wp:anchor distT="960755" distB="997585" distL="0" distR="0" simplePos="0" relativeHeight="2" behindDoc="0" locked="0" layoutInCell="0" allowOverlap="1" wp14:anchorId="45DC24DE" wp14:editId="297F3D47">
                 <wp:simplePos x="0" y="0"/>
                 <wp:positionH relativeFrom="column">
                   <wp:align>center</wp:align>
@@ -174,6 +164,7 @@
                 <wp:effectExtent l="0" t="635" r="0" b="0"/>
                 <wp:wrapTopAndBottom/>
                 <wp:docPr id="2" name="Group 4"/>
+                <wp:cNvGraphicFramePr/>
                 <a:graphic xmlns:a="http://schemas.openxmlformats.org/drawingml/2006/main">
                   <a:graphicData uri="http://schemas.microsoft.com/office/word/2010/wordprocessingGroup">
                     <wpg:wgp>
@@ -187,7 +178,8 @@
                         </a:xfrm>
                       </wpg:grpSpPr>
                       <wps:wsp>
-                        <wps:cNvSpPr/>
+                        <wps:cNvPr id="3" name="Straight Connector 3"/>
+                        <wps:cNvCnPr/>
                         <wps:spPr>
                           <a:xfrm flipH="1" flipV="1">
                             <a:off x="228600" y="0"/>
@@ -217,7 +209,8 @@
                         <wps:bodyPr/>
                       </wps:wsp>
                       <wps:wsp>
-                        <wps:cNvSpPr/>
+                        <wps:cNvPr id="4" name="Straight Connector 4"/>
+                        <wps:cNvCnPr/>
                         <wps:spPr>
                           <a:xfrm flipH="1" flipV="1">
                             <a:off x="456480" y="387360"/>
@@ -247,7 +240,8 @@
                         <wps:bodyPr/>
                       </wps:wsp>
                       <wps:wsp>
-                        <wps:cNvSpPr/>
+                        <wps:cNvPr id="5" name="Straight Connector 5"/>
+                        <wps:cNvCnPr/>
                         <wps:spPr>
                           <a:xfrm flipH="1" flipV="1">
                             <a:off x="0" y="387360"/>
@@ -282,7 +276,7 @@
               </wp:anchor>
             </w:drawing>
           </mc:Choice>
-          <mc:Fallback>
+          <mc:Fallback xmlns:pic="http://schemas.openxmlformats.org/drawingml/2006/picture">
             <w:pict>
               <v:group id="shape_0" alt="Group 4" style="position:absolute;margin-left:243.65pt;margin-top:160.55pt;width:35.9pt;height:154.75pt" coordorigin="4873,3211" coordsize="718,3095">
                 <v:line id="shape_0" from="5233,3211" to="5233,6306" stroked="t" o:allowincell="f" style="position:absolute;flip:xy;mso-position-horizontal:center">
@@ -307,7 +301,7 @@
       </w:r>
       <w:r>
         <w:rPr>
-          <w:rFonts w:cs="Times New Roman" w:ascii="Times New Roman" w:hAnsi="Times New Roman"/>
+          <w:rFonts w:ascii="Times New Roman" w:hAnsi="Times New Roman" w:cs="Times New Roman"/>
           <w:b/>
           <w:bCs/>
           <w:sz w:val="28"/>
@@ -318,7 +312,6 @@
     </w:p>
     <w:p>
       <w:pPr>
-        <w:pStyle w:val="Normal"/>
         <w:spacing w:before="432" w:after="144"/>
         <w:jc w:val="center"/>
         <w:rPr>
@@ -328,7 +321,7 @@
       </w:pPr>
       <w:r>
         <w:rPr>
-          <w:rFonts w:cs="Times New Roman" w:ascii="Times New Roman" w:hAnsi="Times New Roman"/>
+          <w:rFonts w:ascii="Times New Roman" w:hAnsi="Times New Roman" w:cs="Times New Roman"/>
           <w:b/>
           <w:bCs/>
           <w:sz w:val="28"/>
@@ -339,7 +332,7 @@
     </w:p>
     <w:p>
       <w:pPr>
-        <w:pStyle w:val="Normal"/>
+        <w:ind w:left="1440"/>
         <w:jc w:val="center"/>
         <w:rPr>
           <w:sz w:val="28"/>
@@ -348,18 +341,37 @@
       </w:pPr>
       <w:r>
         <w:rPr>
-          <w:rFonts w:cs="Times New Roman" w:ascii="Times New Roman" w:hAnsi="Times New Roman"/>
-          <w:b/>
-          <w:bCs/>
-          <w:sz w:val="28"/>
-          <w:szCs w:val="28"/>
-        </w:rPr>
-        <w:t>…………………………………………………………</w:t>
+          <w:rFonts w:ascii="Times New Roman" w:hAnsi="Times New Roman" w:cs="Times New Roman"/>
+          <w:b/>
+          <w:bCs/>
+          <w:sz w:val="28"/>
+          <w:szCs w:val="28"/>
+        </w:rPr>
+        <w:t xml:space="preserve">  </w:t>
+      </w:r>
+      <w:r>
+        <w:rPr>
+          <w:rFonts w:ascii="Times New Roman" w:hAnsi="Times New Roman" w:cs="Times New Roman"/>
+          <w:b/>
+          <w:bCs/>
+          <w:sz w:val="28"/>
+          <w:szCs w:val="28"/>
+        </w:rPr>
+        <w:t>…………………………………………</w:t>
+      </w:r>
+      <w:r>
+        <w:rPr>
+          <w:rFonts w:ascii="Times New Roman" w:hAnsi="Times New Roman" w:cs="Times New Roman"/>
+          <w:b/>
+          <w:bCs/>
+          <w:sz w:val="28"/>
+          <w:szCs w:val="28"/>
+        </w:rPr>
+        <w:t>.</w:t>
       </w:r>
     </w:p>
     <w:p>
       <w:pPr>
-        <w:pStyle w:val="Normal"/>
         <w:jc w:val="center"/>
         <w:rPr>
           <w:rFonts w:ascii="Times New Roman" w:hAnsi="Times New Roman" w:cs="Times New Roman"/>
@@ -369,22 +381,11 @@
           <w:szCs w:val="28"/>
         </w:rPr>
       </w:pPr>
-      <w:r>
-        <w:rPr>
-          <w:rFonts w:cs="Times New Roman" w:ascii="Times New Roman" w:hAnsi="Times New Roman"/>
-          <w:b/>
-          <w:bCs/>
-          <w:sz w:val="28"/>
-          <w:szCs w:val="28"/>
-        </w:rPr>
-      </w:r>
     </w:p>
     <w:p>
       <w:pPr>
-        <w:pStyle w:val="Normal"/>
         <w:tabs>
-          <w:tab w:val="clear" w:pos="720"/>
-          <w:tab w:val="right" w:pos="10206" w:leader="none"/>
+          <w:tab w:val="right" w:pos="10206"/>
         </w:tabs>
         <w:rPr>
           <w:sz w:val="28"/>
@@ -393,23 +394,40 @@
       </w:pPr>
       <w:r>
         <w:rPr>
-          <w:rFonts w:cs="Times New Roman" w:ascii="Times New Roman" w:hAnsi="Times New Roman"/>
+          <w:rFonts w:ascii="Times New Roman" w:hAnsi="Times New Roman" w:cs="Times New Roman"/>
+          <w:b/>
+          <w:bCs/>
+          <w:sz w:val="28"/>
+          <w:szCs w:val="28"/>
+        </w:rPr>
+        <w:t xml:space="preserve"> </w:t>
+      </w:r>
+      <w:r>
+        <w:rPr>
+          <w:rFonts w:ascii="Times New Roman" w:hAnsi="Times New Roman" w:cs="Times New Roman"/>
           <w:b/>
           <w:bCs/>
           <w:sz w:val="28"/>
           <w:szCs w:val="28"/>
         </w:rPr>
         <w:t>Submitted By:</w:t>
+      </w:r>
+      <w:r>
+        <w:rPr>
+          <w:rFonts w:ascii="Times New Roman" w:hAnsi="Times New Roman" w:cs="Times New Roman"/>
+          <w:b/>
+          <w:bCs/>
+          <w:sz w:val="28"/>
+          <w:szCs w:val="28"/>
+        </w:rPr>
         <w:tab/>
         <w:t>Submitted To:</w:t>
       </w:r>
     </w:p>
     <w:p>
       <w:pPr>
-        <w:pStyle w:val="Normal"/>
         <w:tabs>
-          <w:tab w:val="clear" w:pos="720"/>
-          <w:tab w:val="right" w:pos="10206" w:leader="none"/>
+          <w:tab w:val="right" w:pos="10206"/>
         </w:tabs>
         <w:rPr>
           <w:sz w:val="28"/>
@@ -418,23 +436,62 @@
       </w:pPr>
       <w:r>
         <w:rPr>
-          <w:rFonts w:cs="Times New Roman" w:ascii="Times New Roman" w:hAnsi="Times New Roman"/>
-          <w:b/>
-          <w:bCs/>
-          <w:sz w:val="28"/>
-          <w:szCs w:val="28"/>
-        </w:rPr>
-        <w:t>Name: {{student_name}}</w:t>
+          <w:rFonts w:ascii="Times New Roman" w:hAnsi="Times New Roman" w:cs="Times New Roman"/>
+          <w:b/>
+          <w:bCs/>
+          <w:sz w:val="28"/>
+          <w:szCs w:val="28"/>
+        </w:rPr>
+        <w:t xml:space="preserve"> </w:t>
+      </w:r>
+      <w:r>
+        <w:rPr>
+          <w:rFonts w:ascii="Times New Roman" w:hAnsi="Times New Roman" w:cs="Times New Roman"/>
+          <w:b/>
+          <w:bCs/>
+          <w:sz w:val="28"/>
+          <w:szCs w:val="28"/>
+        </w:rPr>
+        <w:t>Name: {{</w:t>
+      </w:r>
+      <w:proofErr w:type="spellStart"/>
+      <w:r>
+        <w:rPr>
+          <w:rFonts w:ascii="Times New Roman" w:hAnsi="Times New Roman" w:cs="Times New Roman"/>
+          <w:b/>
+          <w:bCs/>
+          <w:sz w:val="28"/>
+          <w:szCs w:val="28"/>
+        </w:rPr>
+        <w:t>student_name</w:t>
+      </w:r>
+      <w:proofErr w:type="spellEnd"/>
+      <w:r>
+        <w:rPr>
+          <w:rFonts w:ascii="Times New Roman" w:hAnsi="Times New Roman" w:cs="Times New Roman"/>
+          <w:b/>
+          <w:bCs/>
+          <w:sz w:val="28"/>
+          <w:szCs w:val="28"/>
+        </w:rPr>
+        <w:t>}}</w:t>
+      </w:r>
+      <w:r>
+        <w:rPr>
+          <w:rFonts w:ascii="Times New Roman" w:hAnsi="Times New Roman" w:cs="Times New Roman"/>
+          <w:b/>
+          <w:bCs/>
+          <w:sz w:val="28"/>
+          <w:szCs w:val="28"/>
+        </w:rPr>
         <w:tab/>
         <w:t>Department of</w:t>
       </w:r>
     </w:p>
     <w:p>
       <w:pPr>
-        <w:pStyle w:val="Normal"/>
         <w:tabs>
-          <w:tab w:val="clear" w:pos="720"/>
-          <w:tab w:val="right" w:pos="10206" w:leader="none"/>
+          <w:tab w:val="right" w:pos="10206"/>
         </w:tabs>
         <w:rPr>
           <w:sz w:val="28"/>
@@ -443,25 +500,63 @@
       </w:pPr>
       <w:r>
         <w:rPr>
-          <w:rFonts w:cs="Times New Roman" w:ascii="Times New Roman" w:hAnsi="Times New Roman"/>
-          <w:b/>
-          <w:bCs/>
-          <w:sz w:val="28"/>
-          <w:szCs w:val="28"/>
-        </w:rPr>
-        <w:t>Roll No: {{roll_num}}</w:t>
+          <w:rFonts w:ascii="Times New Roman" w:hAnsi="Times New Roman" w:cs="Times New Roman"/>
+          <w:b/>
+          <w:bCs/>
+          <w:sz w:val="28"/>
+          <w:szCs w:val="28"/>
+        </w:rPr>
+        <w:t xml:space="preserve"> </w:t>
+      </w:r>
+      <w:r>
+        <w:rPr>
+          <w:rFonts w:ascii="Times New Roman" w:hAnsi="Times New Roman" w:cs="Times New Roman"/>
+          <w:b/>
+          <w:bCs/>
+          <w:sz w:val="28"/>
+          <w:szCs w:val="28"/>
+        </w:rPr>
+        <w:t>Roll No: {{</w:t>
+      </w:r>
+      <w:proofErr w:type="spellStart"/>
+      <w:r>
+        <w:rPr>
+          <w:rFonts w:ascii="Times New Roman" w:hAnsi="Times New Roman" w:cs="Times New Roman"/>
+          <w:b/>
+          <w:bCs/>
+          <w:sz w:val="28"/>
+          <w:szCs w:val="28"/>
+        </w:rPr>
+        <w:t>roll_num</w:t>
+      </w:r>
+      <w:proofErr w:type="spellEnd"/>
+      <w:r>
+        <w:rPr>
+          <w:rFonts w:ascii="Times New Roman" w:hAnsi="Times New Roman" w:cs="Times New Roman"/>
+          <w:b/>
+          <w:bCs/>
+          <w:sz w:val="28"/>
+          <w:szCs w:val="28"/>
+        </w:rPr>
+        <w:t>}}</w:t>
+      </w:r>
+      <w:r>
+        <w:rPr>
+          <w:rFonts w:ascii="Times New Roman" w:hAnsi="Times New Roman" w:cs="Times New Roman"/>
+          <w:b/>
+          <w:bCs/>
+          <w:sz w:val="28"/>
+          <w:szCs w:val="28"/>
+        </w:rPr>
         <w:tab/>
         <w:t>Computer and</w:t>
       </w:r>
     </w:p>
     <w:p>
       <w:pPr>
-        <w:pStyle w:val="Normal"/>
         <w:tabs>
-          <w:tab w:val="clear" w:pos="720"/>
-          <w:tab w:val="right" w:pos="10206" w:leader="none"/>
+          <w:tab w:val="right" w:pos="10206"/>
         </w:tabs>
-        <w:spacing w:before="0" w:after="160"/>
         <w:rPr>
           <w:sz w:val="28"/>
           <w:szCs w:val="28"/>
@@ -469,42 +564,59 @@
       </w:pPr>
       <w:r>
         <w:rPr>
-          <w:rFonts w:cs="Times New Roman" w:ascii="Times New Roman" w:hAnsi="Times New Roman"/>
+          <w:rFonts w:ascii="Times New Roman" w:hAnsi="Times New Roman" w:cs="Times New Roman"/>
+          <w:b/>
+          <w:bCs/>
+          <w:sz w:val="28"/>
+          <w:szCs w:val="28"/>
+        </w:rPr>
+        <w:t xml:space="preserve"> </w:t>
+      </w:r>
+      <w:r>
+        <w:rPr>
+          <w:rFonts w:ascii="Times New Roman" w:hAnsi="Times New Roman" w:cs="Times New Roman"/>
           <w:b/>
           <w:bCs/>
           <w:sz w:val="28"/>
           <w:szCs w:val="28"/>
         </w:rPr>
         <w:t>Submission Date: ……………………</w:t>
+      </w:r>
+      <w:r>
+        <w:rPr>
+          <w:rFonts w:ascii="Times New Roman" w:hAnsi="Times New Roman" w:cs="Times New Roman"/>
+          <w:b/>
+          <w:bCs/>
+          <w:sz w:val="28"/>
+          <w:szCs w:val="28"/>
+        </w:rPr>
         <w:tab/>
         <w:t>Electronics Engineering</w:t>
       </w:r>
     </w:p>
     <w:sectPr>
-      <w:type w:val="nextPage"/>
       <w:pgSz w:w="11906" w:h="16838"/>
-      <w:pgMar w:left="720" w:right="720" w:gutter="0" w:header="0" w:top="720" w:footer="0" w:bottom="720"/>
-      <w:pgBorders w:display="allPages" w:offsetFrom="text">
+      <w:pgMar w:top="720" w:right="720" w:bottom="720" w:left="720" w:header="0" w:footer="0" w:gutter="0"/>
+      <w:pgBorders>
         <w:top w:val="thinThickSmallGap" w:sz="12" w:space="3" w:color="000000"/>
         <w:left w:val="thinThickSmallGap" w:sz="12" w:space="3" w:color="000000"/>
         <w:bottom w:val="thickThinSmallGap" w:sz="12" w:space="3" w:color="000000"/>
         <w:right w:val="thickThinSmallGap" w:sz="12" w:space="3" w:color="000000"/>
       </w:pgBorders>
-      <w:pgNumType w:fmt="decimal"/>
-      <w:formProt w:val="false"/>
-      <w:textDirection w:val="lrTb"/>
-      <w:docGrid w:type="default" w:linePitch="360" w:charSpace="0"/>
+      <w:cols w:space="720"/>
+      <w:formProt w:val="0"/>
+      <w:docGrid w:linePitch="360"/>
     </w:sectPr>
   </w:body>
 </w:document>
 </file>
 
 <file path=word/styles.xml><?xml version="1.0" encoding="utf-8"?>
-<w:styles xmlns:w="http://schemas.openxmlformats.org/wordprocessingml/2006/main" xmlns:w14="http://schemas.microsoft.com/office/word/2010/wordml" xmlns:mc="http://schemas.openxmlformats.org/markup-compatibility/2006" mc:Ignorable="w14">
+<w:styles xmlns:mc="http://schemas.openxmlformats.org/markup-compatibility/2006" xmlns:r="http://schemas.openxmlformats.org/officeDocument/2006/relationships" xmlns:w="http://schemas.openxmlformats.org/wordprocessingml/2006/main" xmlns:w14="http://schemas.microsoft.com/office/word/2010/wordml" xmlns:w15="http://schemas.microsoft.com/office/word/2012/wordml" xmlns:w16cex="http://schemas.microsoft.com/office/word/2018/wordml/cex" xmlns:w16cid="http://schemas.microsoft.com/office/word/2016/wordml/cid" xmlns:w16="http://schemas.microsoft.com/office/word/2018/wordml" xmlns:w16sdtdh="http://schemas.microsoft.com/office/word/2020/wordml/sdtdatahash" xmlns:w16se="http://schemas.microsoft.com/office/word/2015/wordml/symex" mc:Ignorable="w14 w15 w16se w16cid w16 w16cex w16sdtdh">
   <w:docDefaults>
     <w:rPrDefault>
       <w:rPr>
-        <w:rFonts w:ascii="Calibri" w:hAnsi="Calibri" w:eastAsia="Calibri" w:cs="" w:asciiTheme="minorHAnsi" w:cstheme="minorBidi" w:eastAsiaTheme="minorHAnsi" w:hAnsiTheme="minorHAnsi"/>
+        <w:rFonts w:asciiTheme="minorHAnsi" w:eastAsiaTheme="minorHAnsi" w:hAnsiTheme="minorHAnsi" w:cstheme="minorBidi"/>
         <w:kern w:val="2"/>
         <w:sz w:val="24"/>
         <w:szCs w:val="24"/>
@@ -514,21 +626,21 @@
     </w:rPrDefault>
     <w:pPrDefault>
       <w:pPr>
-        <w:suppressAutoHyphens w:val="true"/>
+        <w:suppressAutoHyphens/>
       </w:pPr>
     </w:pPrDefault>
   </w:docDefaults>
   <w:latentStyles w:defLockedState="0" w:defUIPriority="99" w:defSemiHidden="0" w:defUnhideWhenUsed="0" w:defQFormat="0" w:count="376">
     <w:lsdException w:name="Normal" w:uiPriority="0" w:qFormat="1"/>
     <w:lsdException w:name="heading 1" w:uiPriority="9" w:qFormat="1"/>
-    <w:lsdException w:name="heading 2" w:uiPriority="9" w:semiHidden="1" w:unhideWhenUsed="1" w:qFormat="1"/>
-    <w:lsdException w:name="heading 3" w:uiPriority="9" w:semiHidden="1" w:unhideWhenUsed="1" w:qFormat="1"/>
-    <w:lsdException w:name="heading 4" w:uiPriority="9" w:semiHidden="1" w:unhideWhenUsed="1" w:qFormat="1"/>
-    <w:lsdException w:name="heading 5" w:uiPriority="9" w:semiHidden="1" w:unhideWhenUsed="1" w:qFormat="1"/>
-    <w:lsdException w:name="heading 6" w:uiPriority="9" w:semiHidden="1" w:unhideWhenUsed="1" w:qFormat="1"/>
-    <w:lsdException w:name="heading 7" w:uiPriority="9" w:semiHidden="1" w:unhideWhenUsed="1" w:qFormat="1"/>
-    <w:lsdException w:name="heading 8" w:uiPriority="9" w:semiHidden="1" w:unhideWhenUsed="1" w:qFormat="1"/>
-    <w:lsdException w:name="heading 9" w:uiPriority="9" w:semiHidden="1" w:unhideWhenUsed="1" w:qFormat="1"/>
+    <w:lsdException w:name="heading 2" w:semiHidden="1" w:uiPriority="9" w:unhideWhenUsed="1" w:qFormat="1"/>
+    <w:lsdException w:name="heading 3" w:semiHidden="1" w:uiPriority="9" w:unhideWhenUsed="1" w:qFormat="1"/>
+    <w:lsdException w:name="heading 4" w:semiHidden="1" w:uiPriority="9" w:unhideWhenUsed="1" w:qFormat="1"/>
+    <w:lsdException w:name="heading 5" w:semiHidden="1" w:uiPriority="9" w:unhideWhenUsed="1" w:qFormat="1"/>
+    <w:lsdException w:name="heading 6" w:semiHidden="1" w:uiPriority="9" w:unhideWhenUsed="1" w:qFormat="1"/>
+    <w:lsdException w:name="heading 7" w:semiHidden="1" w:uiPriority="9" w:unhideWhenUsed="1" w:qFormat="1"/>
+    <w:lsdException w:name="heading 8" w:semiHidden="1" w:uiPriority="9" w:unhideWhenUsed="1" w:qFormat="1"/>
+    <w:lsdException w:name="heading 9" w:semiHidden="1" w:uiPriority="9" w:unhideWhenUsed="1" w:qFormat="1"/>
     <w:lsdException w:name="index 1" w:semiHidden="1" w:unhideWhenUsed="1"/>
     <w:lsdException w:name="index 2" w:semiHidden="1" w:unhideWhenUsed="1"/>
     <w:lsdException w:name="index 3" w:semiHidden="1" w:unhideWhenUsed="1"/>
@@ -538,22 +650,22 @@
     <w:lsdException w:name="index 7" w:semiHidden="1" w:unhideWhenUsed="1"/>
     <w:lsdException w:name="index 8" w:semiHidden="1" w:unhideWhenUsed="1"/>
     <w:lsdException w:name="index 9" w:semiHidden="1" w:unhideWhenUsed="1"/>
-    <w:lsdException w:name="toc 1" w:uiPriority="39" w:semiHidden="1" w:unhideWhenUsed="1"/>
-    <w:lsdException w:name="toc 2" w:uiPriority="39" w:semiHidden="1" w:unhideWhenUsed="1"/>
-    <w:lsdException w:name="toc 3" w:uiPriority="39" w:semiHidden="1" w:unhideWhenUsed="1"/>
-    <w:lsdException w:name="toc 4" w:uiPriority="39" w:semiHidden="1" w:unhideWhenUsed="1"/>
-    <w:lsdException w:name="toc 5" w:uiPriority="39" w:semiHidden="1" w:unhideWhenUsed="1"/>
-    <w:lsdException w:name="toc 6" w:uiPriority="39" w:semiHidden="1" w:unhideWhenUsed="1"/>
-    <w:lsdException w:name="toc 7" w:uiPriority="39" w:semiHidden="1" w:unhideWhenUsed="1"/>
-    <w:lsdException w:name="toc 8" w:uiPriority="39" w:semiHidden="1" w:unhideWhenUsed="1"/>
-    <w:lsdException w:name="toc 9" w:uiPriority="39" w:semiHidden="1" w:unhideWhenUsed="1"/>
+    <w:lsdException w:name="toc 1" w:semiHidden="1" w:uiPriority="39" w:unhideWhenUsed="1"/>
+    <w:lsdException w:name="toc 2" w:semiHidden="1" w:uiPriority="39" w:unhideWhenUsed="1"/>
+    <w:lsdException w:name="toc 3" w:semiHidden="1" w:uiPriority="39" w:unhideWhenUsed="1"/>
+    <w:lsdException w:name="toc 4" w:semiHidden="1" w:uiPriority="39" w:unhideWhenUsed="1"/>
+    <w:lsdException w:name="toc 5" w:semiHidden="1" w:uiPriority="39" w:unhideWhenUsed="1"/>
+    <w:lsdException w:name="toc 6" w:semiHidden="1" w:uiPriority="39" w:unhideWhenUsed="1"/>
+    <w:lsdException w:name="toc 7" w:semiHidden="1" w:uiPriority="39" w:unhideWhenUsed="1"/>
+    <w:lsdException w:name="toc 8" w:semiHidden="1" w:uiPriority="39" w:unhideWhenUsed="1"/>
+    <w:lsdException w:name="toc 9" w:semiHidden="1" w:uiPriority="39" w:unhideWhenUsed="1"/>
     <w:lsdException w:name="Normal Indent" w:semiHidden="1" w:unhideWhenUsed="1"/>
     <w:lsdException w:name="footnote text" w:semiHidden="1" w:unhideWhenUsed="1"/>
     <w:lsdException w:name="annotation text" w:semiHidden="1" w:unhideWhenUsed="1"/>
     <w:lsdException w:name="header" w:semiHidden="1" w:unhideWhenUsed="1"/>
     <w:lsdException w:name="footer" w:semiHidden="1" w:unhideWhenUsed="1"/>
     <w:lsdException w:name="index heading" w:semiHidden="1" w:unhideWhenUsed="1"/>
-    <w:lsdException w:name="caption" w:uiPriority="35" w:semiHidden="1" w:unhideWhenUsed="1" w:qFormat="1"/>
+    <w:lsdException w:name="caption" w:semiHidden="1" w:uiPriority="35" w:unhideWhenUsed="1" w:qFormat="1"/>
     <w:lsdException w:name="table of figures" w:semiHidden="1" w:unhideWhenUsed="1"/>
     <w:lsdException w:name="envelope address" w:semiHidden="1" w:unhideWhenUsed="1"/>
     <w:lsdException w:name="envelope return" w:semiHidden="1" w:unhideWhenUsed="1"/>
@@ -584,7 +696,7 @@
     <w:lsdException w:name="Title" w:uiPriority="10" w:qFormat="1"/>
     <w:lsdException w:name="Closing" w:semiHidden="1" w:unhideWhenUsed="1"/>
     <w:lsdException w:name="Signature" w:semiHidden="1" w:unhideWhenUsed="1"/>
-    <w:lsdException w:name="Default Paragraph Font" w:uiPriority="1" w:semiHidden="1" w:unhideWhenUsed="1"/>
+    <w:lsdException w:name="Default Paragraph Font" w:semiHidden="1" w:uiPriority="1" w:unhideWhenUsed="1"/>
     <w:lsdException w:name="Body Text" w:semiHidden="1" w:unhideWhenUsed="1"/>
     <w:lsdException w:name="Body Text Indent" w:semiHidden="1" w:unhideWhenUsed="1"/>
     <w:lsdException w:name="List Continue" w:semiHidden="1" w:unhideWhenUsed="1"/>
@@ -784,8 +896,8 @@
     <w:lsdException w:name="Subtle Reference" w:uiPriority="31" w:qFormat="1"/>
     <w:lsdException w:name="Intense Reference" w:uiPriority="32" w:qFormat="1"/>
     <w:lsdException w:name="Book Title" w:uiPriority="33" w:qFormat="1"/>
-    <w:lsdException w:name="Bibliography" w:uiPriority="37" w:semiHidden="1" w:unhideWhenUsed="1"/>
-    <w:lsdException w:name="TOC Heading" w:uiPriority="39" w:semiHidden="1" w:unhideWhenUsed="1" w:qFormat="1"/>
+    <w:lsdException w:name="Bibliography" w:semiHidden="1" w:uiPriority="37" w:unhideWhenUsed="1"/>
+    <w:lsdException w:name="TOC Heading" w:semiHidden="1" w:uiPriority="39" w:unhideWhenUsed="1" w:qFormat="1"/>
     <w:lsdException w:name="Plain Table 1" w:uiPriority="41"/>
     <w:lsdException w:name="Plain Table 2" w:uiPriority="42"/>
     <w:lsdException w:name="Plain Table 3" w:uiPriority="43"/>
@@ -896,25 +1008,12 @@
     <w:lsdException w:name="Unresolved Mention" w:semiHidden="1" w:unhideWhenUsed="1"/>
     <w:lsdException w:name="Smart Link" w:semiHidden="1" w:unhideWhenUsed="1"/>
   </w:latentStyles>
-  <w:style w:type="paragraph" w:styleId="Normal" w:default="1">
+  <w:style w:type="paragraph" w:default="1" w:styleId="Normal">
     <w:name w:val="Normal"/>
     <w:qFormat/>
     <w:pPr>
-      <w:widowControl/>
-      <w:suppressAutoHyphens w:val="true"/>
-      <w:bidi w:val="0"/>
-      <w:spacing w:lineRule="auto" w:line="278" w:before="0" w:after="160"/>
-      <w:jc w:val="start"/>
+      <w:spacing w:after="160" w:line="278" w:lineRule="auto"/>
     </w:pPr>
-    <w:rPr>
-      <w:rFonts w:ascii="Calibri" w:hAnsi="Calibri" w:eastAsia="Calibri" w:cs="" w:asciiTheme="minorHAnsi" w:cstheme="minorBidi" w:eastAsiaTheme="minorHAnsi" w:hAnsiTheme="minorHAnsi"/>
-      <w:color w:val="auto"/>
-      <w:kern w:val="2"/>
-      <w:sz w:val="24"/>
-      <w:szCs w:val="24"/>
-      <w:lang w:val="en-US" w:eastAsia="en-US" w:bidi="ar-SA"/>
-      <w14:ligatures w14:val="standardContextual"/>
-    </w:rPr>
   </w:style>
   <w:style w:type="paragraph" w:styleId="Heading1">
     <w:name w:val="heading 1"/>
@@ -923,16 +1022,16 @@
     <w:link w:val="Heading1Char"/>
     <w:uiPriority w:val="9"/>
     <w:qFormat/>
-    <w:rsid w:val="007c036e"/>
+    <w:rsid w:val="007C036E"/>
     <w:pPr>
-      <w:keepNext w:val="true"/>
+      <w:keepNext/>
       <w:keepLines/>
       <w:spacing w:before="360" w:after="80"/>
       <w:outlineLvl w:val="0"/>
     </w:pPr>
     <w:rPr>
-      <w:rFonts w:ascii="Calibri Light" w:hAnsi="Calibri Light" w:eastAsia="" w:cs="" w:asciiTheme="majorHAnsi" w:cstheme="majorBidi" w:eastAsiaTheme="majorEastAsia" w:hAnsiTheme="majorHAnsi"/>
-      <w:color w:themeColor="accent1" w:themeShade="bf" w:val="2F5496"/>
+      <w:rFonts w:asciiTheme="majorHAnsi" w:eastAsiaTheme="majorEastAsia" w:hAnsiTheme="majorHAnsi" w:cstheme="majorBidi"/>
+      <w:color w:val="2F5496" w:themeColor="accent1" w:themeShade="BF"/>
       <w:sz w:val="40"/>
       <w:szCs w:val="40"/>
     </w:rPr>
@@ -946,16 +1045,16 @@
     <w:semiHidden/>
     <w:unhideWhenUsed/>
     <w:qFormat/>
-    <w:rsid w:val="007c036e"/>
+    <w:rsid w:val="007C036E"/>
     <w:pPr>
-      <w:keepNext w:val="true"/>
+      <w:keepNext/>
       <w:keepLines/>
       <w:spacing w:before="160" w:after="80"/>
       <w:outlineLvl w:val="1"/>
     </w:pPr>
     <w:rPr>
-      <w:rFonts w:ascii="Calibri Light" w:hAnsi="Calibri Light" w:eastAsia="" w:cs="" w:asciiTheme="majorHAnsi" w:cstheme="majorBidi" w:eastAsiaTheme="majorEastAsia" w:hAnsiTheme="majorHAnsi"/>
-      <w:color w:themeColor="accent1" w:themeShade="bf" w:val="2F5496"/>
+      <w:rFonts w:asciiTheme="majorHAnsi" w:eastAsiaTheme="majorEastAsia" w:hAnsiTheme="majorHAnsi" w:cstheme="majorBidi"/>
+      <w:color w:val="2F5496" w:themeColor="accent1" w:themeShade="BF"/>
       <w:sz w:val="32"/>
       <w:szCs w:val="32"/>
     </w:rPr>
@@ -969,16 +1068,16 @@
     <w:semiHidden/>
     <w:unhideWhenUsed/>
     <w:qFormat/>
-    <w:rsid w:val="007c036e"/>
+    <w:rsid w:val="007C036E"/>
     <w:pPr>
-      <w:keepNext w:val="true"/>
+      <w:keepNext/>
       <w:keepLines/>
       <w:spacing w:before="160" w:after="80"/>
       <w:outlineLvl w:val="2"/>
     </w:pPr>
     <w:rPr>
-      <w:rFonts w:eastAsia="" w:cs="" w:cstheme="majorBidi" w:eastAsiaTheme="majorEastAsia"/>
-      <w:color w:themeColor="accent1" w:themeShade="bf" w:val="2F5496"/>
+      <w:rFonts w:eastAsiaTheme="majorEastAsia" w:cstheme="majorBidi"/>
+      <w:color w:val="2F5496" w:themeColor="accent1" w:themeShade="BF"/>
       <w:sz w:val="28"/>
       <w:szCs w:val="28"/>
     </w:rPr>
@@ -992,18 +1091,18 @@
     <w:semiHidden/>
     <w:unhideWhenUsed/>
     <w:qFormat/>
-    <w:rsid w:val="007c036e"/>
+    <w:rsid w:val="007C036E"/>
     <w:pPr>
-      <w:keepNext w:val="true"/>
+      <w:keepNext/>
       <w:keepLines/>
       <w:spacing w:before="80" w:after="40"/>
       <w:outlineLvl w:val="3"/>
     </w:pPr>
     <w:rPr>
-      <w:rFonts w:eastAsia="" w:cs="" w:cstheme="majorBidi" w:eastAsiaTheme="majorEastAsia"/>
+      <w:rFonts w:eastAsiaTheme="majorEastAsia" w:cstheme="majorBidi"/>
       <w:i/>
       <w:iCs/>
-      <w:color w:themeColor="accent1" w:themeShade="bf" w:val="2F5496"/>
+      <w:color w:val="2F5496" w:themeColor="accent1" w:themeShade="BF"/>
     </w:rPr>
   </w:style>
   <w:style w:type="paragraph" w:styleId="Heading5">
@@ -1015,16 +1114,16 @@
     <w:semiHidden/>
     <w:unhideWhenUsed/>
     <w:qFormat/>
-    <w:rsid w:val="007c036e"/>
+    <w:rsid w:val="007C036E"/>
     <w:pPr>
-      <w:keepNext w:val="true"/>
+      <w:keepNext/>
       <w:keepLines/>
       <w:spacing w:before="80" w:after="40"/>
       <w:outlineLvl w:val="4"/>
     </w:pPr>
     <w:rPr>
-      <w:rFonts w:eastAsia="" w:cs="" w:cstheme="majorBidi" w:eastAsiaTheme="majorEastAsia"/>
-      <w:color w:themeColor="accent1" w:themeShade="bf" w:val="2F5496"/>
+      <w:rFonts w:eastAsiaTheme="majorEastAsia" w:cstheme="majorBidi"/>
+      <w:color w:val="2F5496" w:themeColor="accent1" w:themeShade="BF"/>
     </w:rPr>
   </w:style>
   <w:style w:type="paragraph" w:styleId="Heading6">
@@ -1036,18 +1135,18 @@
     <w:semiHidden/>
     <w:unhideWhenUsed/>
     <w:qFormat/>
-    <w:rsid w:val="007c036e"/>
+    <w:rsid w:val="007C036E"/>
     <w:pPr>
-      <w:keepNext w:val="true"/>
+      <w:keepNext/>
       <w:keepLines/>
       <w:spacing w:before="40" w:after="0"/>
       <w:outlineLvl w:val="5"/>
     </w:pPr>
     <w:rPr>
-      <w:rFonts w:eastAsia="" w:cs="" w:cstheme="majorBidi" w:eastAsiaTheme="majorEastAsia"/>
+      <w:rFonts w:eastAsiaTheme="majorEastAsia" w:cstheme="majorBidi"/>
       <w:i/>
       <w:iCs/>
-      <w:color w:themeColor="text1" w:themeTint="a6" w:val="595959"/>
+      <w:color w:val="595959" w:themeColor="text1" w:themeTint="A6"/>
     </w:rPr>
   </w:style>
   <w:style w:type="paragraph" w:styleId="Heading7">
@@ -1059,16 +1158,16 @@
     <w:semiHidden/>
     <w:unhideWhenUsed/>
     <w:qFormat/>
-    <w:rsid w:val="007c036e"/>
+    <w:rsid w:val="007C036E"/>
     <w:pPr>
-      <w:keepNext w:val="true"/>
+      <w:keepNext/>
       <w:keepLines/>
       <w:spacing w:before="40" w:after="0"/>
       <w:outlineLvl w:val="6"/>
     </w:pPr>
     <w:rPr>
-      <w:rFonts w:eastAsia="" w:cs="" w:cstheme="majorBidi" w:eastAsiaTheme="majorEastAsia"/>
-      <w:color w:themeColor="text1" w:themeTint="a6" w:val="595959"/>
+      <w:rFonts w:eastAsiaTheme="majorEastAsia" w:cstheme="majorBidi"/>
+      <w:color w:val="595959" w:themeColor="text1" w:themeTint="A6"/>
     </w:rPr>
   </w:style>
   <w:style w:type="paragraph" w:styleId="Heading8">
@@ -1080,18 +1179,18 @@
     <w:semiHidden/>
     <w:unhideWhenUsed/>
     <w:qFormat/>
-    <w:rsid w:val="007c036e"/>
+    <w:rsid w:val="007C036E"/>
     <w:pPr>
-      <w:keepNext w:val="true"/>
+      <w:keepNext/>
       <w:keepLines/>
-      <w:spacing w:before="0" w:after="0"/>
+      <w:spacing w:after="0"/>
       <w:outlineLvl w:val="7"/>
     </w:pPr>
     <w:rPr>
-      <w:rFonts w:eastAsia="" w:cs="" w:cstheme="majorBidi" w:eastAsiaTheme="majorEastAsia"/>
+      <w:rFonts w:eastAsiaTheme="majorEastAsia" w:cstheme="majorBidi"/>
       <w:i/>
       <w:iCs/>
-      <w:color w:themeColor="text1" w:themeTint="d8" w:val="272727"/>
+      <w:color w:val="272727" w:themeColor="text1" w:themeTint="D8"/>
     </w:rPr>
   </w:style>
   <w:style w:type="paragraph" w:styleId="Heading9">
@@ -1103,391 +1202,23 @@
     <w:semiHidden/>
     <w:unhideWhenUsed/>
     <w:qFormat/>
-    <w:rsid w:val="007c036e"/>
+    <w:rsid w:val="007C036E"/>
     <w:pPr>
-      <w:keepNext w:val="true"/>
+      <w:keepNext/>
       <w:keepLines/>
-      <w:spacing w:before="0" w:after="0"/>
+      <w:spacing w:after="0"/>
       <w:outlineLvl w:val="8"/>
     </w:pPr>
     <w:rPr>
-      <w:rFonts w:eastAsia="" w:cs="" w:cstheme="majorBidi" w:eastAsiaTheme="majorEastAsia"/>
-      <w:color w:themeColor="text1" w:themeTint="d8" w:val="272727"/>
-    </w:rPr>
-  </w:style>
-  <w:style w:type="character" w:styleId="DefaultParagraphFont" w:default="1">
+      <w:rFonts w:eastAsiaTheme="majorEastAsia" w:cstheme="majorBidi"/>
+      <w:color w:val="272727" w:themeColor="text1" w:themeTint="D8"/>
+    </w:rPr>
+  </w:style>
+  <w:style w:type="character" w:default="1" w:styleId="DefaultParagraphFont">
     <w:name w:val="Default Paragraph Font"/>
     <w:uiPriority w:val="1"/>
     <w:semiHidden/>
     <w:unhideWhenUsed/>
-    <w:qFormat/>
-    <w:rPr/>
-  </w:style>
-  <w:style w:type="character" w:styleId="Heading1Char" w:customStyle="1">
-    <w:name w:val="Heading 1 Char"/>
-    <w:basedOn w:val="DefaultParagraphFont"/>
-    <w:link w:val="Heading1"/>
-    <w:uiPriority w:val="9"/>
-    <w:qFormat/>
-    <w:rsid w:val="007c036e"/>
-    <w:rPr>
-      <w:rFonts w:ascii="Calibri Light" w:hAnsi="Calibri Light" w:eastAsia="" w:cs="" w:asciiTheme="majorHAnsi" w:cstheme="majorBidi" w:eastAsiaTheme="majorEastAsia" w:hAnsiTheme="majorHAnsi"/>
-      <w:color w:themeColor="accent1" w:themeShade="bf" w:val="2F5496"/>
-      <w:sz w:val="40"/>
-      <w:szCs w:val="40"/>
-    </w:rPr>
-  </w:style>
-  <w:style w:type="character" w:styleId="Heading2Char" w:customStyle="1">
-    <w:name w:val="Heading 2 Char"/>
-    <w:basedOn w:val="DefaultParagraphFont"/>
-    <w:link w:val="Heading2"/>
-    <w:uiPriority w:val="9"/>
-    <w:semiHidden/>
-    <w:qFormat/>
-    <w:rsid w:val="007c036e"/>
-    <w:rPr>
-      <w:rFonts w:ascii="Calibri Light" w:hAnsi="Calibri Light" w:eastAsia="" w:cs="" w:asciiTheme="majorHAnsi" w:cstheme="majorBidi" w:eastAsiaTheme="majorEastAsia" w:hAnsiTheme="majorHAnsi"/>
-      <w:color w:themeColor="accent1" w:themeShade="bf" w:val="2F5496"/>
-      <w:sz w:val="32"/>
-      <w:szCs w:val="32"/>
-    </w:rPr>
-  </w:style>
-  <w:style w:type="character" w:styleId="Heading3Char" w:customStyle="1">
-    <w:name w:val="Heading 3 Char"/>
-    <w:basedOn w:val="DefaultParagraphFont"/>
-    <w:link w:val="Heading3"/>
-    <w:uiPriority w:val="9"/>
-    <w:semiHidden/>
-    <w:qFormat/>
-    <w:rsid w:val="007c036e"/>
-    <w:rPr>
-      <w:rFonts w:eastAsia="" w:cs="" w:cstheme="majorBidi" w:eastAsiaTheme="majorEastAsia"/>
-      <w:color w:themeColor="accent1" w:themeShade="bf" w:val="2F5496"/>
-      <w:sz w:val="28"/>
-      <w:szCs w:val="28"/>
-    </w:rPr>
-  </w:style>
-  <w:style w:type="character" w:styleId="Heading4Char" w:customStyle="1">
-    <w:name w:val="Heading 4 Char"/>
-    <w:basedOn w:val="DefaultParagraphFont"/>
-    <w:link w:val="Heading4"/>
-    <w:uiPriority w:val="9"/>
-    <w:semiHidden/>
-    <w:qFormat/>
-    <w:rsid w:val="007c036e"/>
-    <w:rPr>
-      <w:rFonts w:eastAsia="" w:cs="" w:cstheme="majorBidi" w:eastAsiaTheme="majorEastAsia"/>
-      <w:i/>
-      <w:iCs/>
-      <w:color w:themeColor="accent1" w:themeShade="bf" w:val="2F5496"/>
-    </w:rPr>
-  </w:style>
-  <w:style w:type="character" w:styleId="Heading5Char" w:customStyle="1">
-    <w:name w:val="Heading 5 Char"/>
-    <w:basedOn w:val="DefaultParagraphFont"/>
-    <w:link w:val="Heading5"/>
-    <w:uiPriority w:val="9"/>
-    <w:semiHidden/>
-    <w:qFormat/>
-    <w:rsid w:val="007c036e"/>
-    <w:rPr>
-      <w:rFonts w:eastAsia="" w:cs="" w:cstheme="majorBidi" w:eastAsiaTheme="majorEastAsia"/>
-      <w:color w:themeColor="accent1" w:themeShade="bf" w:val="2F5496"/>
-    </w:rPr>
-  </w:style>
-  <w:style w:type="character" w:styleId="Heading6Char" w:customStyle="1">
-    <w:name w:val="Heading 6 Char"/>
-    <w:basedOn w:val="DefaultParagraphFont"/>
-    <w:link w:val="Heading6"/>
-    <w:uiPriority w:val="9"/>
-    <w:semiHidden/>
-    <w:qFormat/>
-    <w:rsid w:val="007c036e"/>
-    <w:rPr>
-      <w:rFonts w:eastAsia="" w:cs="" w:cstheme="majorBidi" w:eastAsiaTheme="majorEastAsia"/>
-      <w:i/>
-      <w:iCs/>
-      <w:color w:themeColor="text1" w:themeTint="a6" w:val="595959"/>
-    </w:rPr>
-  </w:style>
-  <w:style w:type="character" w:styleId="Heading7Char" w:customStyle="1">
-    <w:name w:val="Heading 7 Char"/>
-    <w:basedOn w:val="DefaultParagraphFont"/>
-    <w:link w:val="Heading7"/>
-    <w:uiPriority w:val="9"/>
-    <w:semiHidden/>
-    <w:qFormat/>
-    <w:rsid w:val="007c036e"/>
-    <w:rPr>
-      <w:rFonts w:eastAsia="" w:cs="" w:cstheme="majorBidi" w:eastAsiaTheme="majorEastAsia"/>
-      <w:color w:themeColor="text1" w:themeTint="a6" w:val="595959"/>
-    </w:rPr>
-  </w:style>
-  <w:style w:type="character" w:styleId="Heading8Char" w:customStyle="1">
-    <w:name w:val="Heading 8 Char"/>
-    <w:basedOn w:val="DefaultParagraphFont"/>
-    <w:link w:val="Heading8"/>
-    <w:uiPriority w:val="9"/>
-    <w:semiHidden/>
-    <w:qFormat/>
-    <w:rsid w:val="007c036e"/>
-    <w:rPr>
-      <w:rFonts w:eastAsia="" w:cs="" w:cstheme="majorBidi" w:eastAsiaTheme="majorEastAsia"/>
-      <w:i/>
-      <w:iCs/>
-      <w:color w:themeColor="text1" w:themeTint="d8" w:val="272727"/>
-    </w:rPr>
-  </w:style>
-  <w:style w:type="character" w:styleId="Heading9Char" w:customStyle="1">
-    <w:name w:val="Heading 9 Char"/>
-    <w:basedOn w:val="DefaultParagraphFont"/>
-    <w:link w:val="Heading9"/>
-    <w:uiPriority w:val="9"/>
-    <w:semiHidden/>
-    <w:qFormat/>
-    <w:rsid w:val="007c036e"/>
-    <w:rPr>
-      <w:rFonts w:eastAsia="" w:cs="" w:cstheme="majorBidi" w:eastAsiaTheme="majorEastAsia"/>
-      <w:color w:themeColor="text1" w:themeTint="d8" w:val="272727"/>
-    </w:rPr>
-  </w:style>
-  <w:style w:type="character" w:styleId="TitleChar" w:customStyle="1">
-    <w:name w:val="Title Char"/>
-    <w:basedOn w:val="DefaultParagraphFont"/>
-    <w:link w:val="Title"/>
-    <w:uiPriority w:val="10"/>
-    <w:qFormat/>
-    <w:rsid w:val="007c036e"/>
-    <w:rPr>
-      <w:rFonts w:ascii="Calibri Light" w:hAnsi="Calibri Light" w:eastAsia="" w:cs="" w:asciiTheme="majorHAnsi" w:cstheme="majorBidi" w:eastAsiaTheme="majorEastAsia" w:hAnsiTheme="majorHAnsi"/>
-      <w:spacing w:val="-10"/>
-      <w:kern w:val="2"/>
-      <w:sz w:val="56"/>
-      <w:szCs w:val="56"/>
-    </w:rPr>
-  </w:style>
-  <w:style w:type="character" w:styleId="SubtitleChar" w:customStyle="1">
-    <w:name w:val="Subtitle Char"/>
-    <w:basedOn w:val="DefaultParagraphFont"/>
-    <w:link w:val="Subtitle"/>
-    <w:uiPriority w:val="11"/>
-    <w:qFormat/>
-    <w:rsid w:val="007c036e"/>
-    <w:rPr>
-      <w:rFonts w:eastAsia="" w:cs="" w:cstheme="majorBidi" w:eastAsiaTheme="majorEastAsia"/>
-      <w:color w:themeColor="text1" w:themeTint="a6" w:val="595959"/>
-      <w:spacing w:val="15"/>
-      <w:sz w:val="28"/>
-      <w:szCs w:val="28"/>
-    </w:rPr>
-  </w:style>
-  <w:style w:type="character" w:styleId="QuoteChar" w:customStyle="1">
-    <w:name w:val="Quote Char"/>
-    <w:basedOn w:val="DefaultParagraphFont"/>
-    <w:link w:val="Quote"/>
-    <w:uiPriority w:val="29"/>
-    <w:qFormat/>
-    <w:rsid w:val="007c036e"/>
-    <w:rPr>
-      <w:i/>
-      <w:iCs/>
-      <w:color w:themeColor="text1" w:themeTint="bf" w:val="404040"/>
-    </w:rPr>
-  </w:style>
-  <w:style w:type="character" w:styleId="IntenseEmphasis">
-    <w:name w:val="Intense Emphasis"/>
-    <w:basedOn w:val="DefaultParagraphFont"/>
-    <w:uiPriority w:val="21"/>
-    <w:qFormat/>
-    <w:rsid w:val="007c036e"/>
-    <w:rPr>
-      <w:i/>
-      <w:iCs/>
-      <w:color w:themeColor="accent1" w:themeShade="bf" w:val="2F5496"/>
-    </w:rPr>
-  </w:style>
-  <w:style w:type="character" w:styleId="IntenseQuoteChar" w:customStyle="1">
-    <w:name w:val="Intense Quote Char"/>
-    <w:basedOn w:val="DefaultParagraphFont"/>
-    <w:link w:val="IntenseQuote"/>
-    <w:uiPriority w:val="30"/>
-    <w:qFormat/>
-    <w:rsid w:val="007c036e"/>
-    <w:rPr>
-      <w:i/>
-      <w:iCs/>
-      <w:color w:themeColor="accent1" w:themeShade="bf" w:val="2F5496"/>
-    </w:rPr>
-  </w:style>
-  <w:style w:type="character" w:styleId="IntenseReference">
-    <w:name w:val="Intense Reference"/>
-    <w:basedOn w:val="DefaultParagraphFont"/>
-    <w:uiPriority w:val="32"/>
-    <w:qFormat/>
-    <w:rsid w:val="007c036e"/>
-    <w:rPr>
-      <w:b/>
-      <w:bCs/>
-      <w:smallCaps/>
-      <w:color w:themeColor="accent1" w:themeShade="bf" w:val="2F5496"/>
-      <w:spacing w:val="5"/>
-    </w:rPr>
-  </w:style>
-  <w:style w:type="paragraph" w:styleId="Heading">
-    <w:name w:val="Heading"/>
-    <w:basedOn w:val="Normal"/>
-    <w:next w:val="BodyText"/>
-    <w:qFormat/>
-    <w:pPr>
-      <w:keepNext w:val="true"/>
-      <w:spacing w:before="240" w:after="120"/>
-    </w:pPr>
-    <w:rPr>
-      <w:rFonts w:ascii="Liberation Sans" w:hAnsi="Liberation Sans" w:eastAsia="PingFang SC" w:cs="Arial Unicode MS"/>
-      <w:sz w:val="28"/>
-      <w:szCs w:val="28"/>
-    </w:rPr>
-  </w:style>
-  <w:style w:type="paragraph" w:styleId="BodyText">
-    <w:name w:val="Body Text"/>
-    <w:basedOn w:val="Normal"/>
-    <w:pPr>
-      <w:spacing w:lineRule="auto" w:line="276" w:before="0" w:after="140"/>
-    </w:pPr>
-    <w:rPr/>
-  </w:style>
-  <w:style w:type="paragraph" w:styleId="List">
-    <w:name w:val="List"/>
-    <w:basedOn w:val="BodyText"/>
-    <w:pPr/>
-    <w:rPr>
-      <w:rFonts w:cs="Arial Unicode MS"/>
-    </w:rPr>
-  </w:style>
-  <w:style w:type="paragraph" w:styleId="Caption">
-    <w:name w:val="caption"/>
-    <w:basedOn w:val="Normal"/>
-    <w:qFormat/>
-    <w:pPr>
-      <w:suppressLineNumbers/>
-      <w:spacing w:before="120" w:after="120"/>
-    </w:pPr>
-    <w:rPr>
-      <w:rFonts w:cs="Arial Unicode MS"/>
-      <w:i/>
-      <w:iCs/>
-      <w:sz w:val="24"/>
-      <w:szCs w:val="24"/>
-    </w:rPr>
-  </w:style>
-  <w:style w:type="paragraph" w:styleId="Index">
-    <w:name w:val="Index"/>
-    <w:basedOn w:val="Normal"/>
-    <w:qFormat/>
-    <w:pPr>
-      <w:suppressLineNumbers/>
-    </w:pPr>
-    <w:rPr>
-      <w:rFonts w:cs="Arial Unicode MS"/>
-    </w:rPr>
-  </w:style>
-  <w:style w:type="paragraph" w:styleId="Title">
-    <w:name w:val="Title"/>
-    <w:basedOn w:val="Normal"/>
-    <w:next w:val="Normal"/>
-    <w:link w:val="TitleChar"/>
-    <w:uiPriority w:val="10"/>
-    <w:qFormat/>
-    <w:rsid w:val="007c036e"/>
-    <w:pPr>
-      <w:spacing w:lineRule="auto" w:line="240" w:before="0" w:after="80"/>
-      <w:contextualSpacing/>
-    </w:pPr>
-    <w:rPr>
-      <w:rFonts w:ascii="Calibri Light" w:hAnsi="Calibri Light" w:eastAsia="" w:cs="" w:asciiTheme="majorHAnsi" w:cstheme="majorBidi" w:eastAsiaTheme="majorEastAsia" w:hAnsiTheme="majorHAnsi"/>
-      <w:spacing w:val="-10"/>
-      <w:kern w:val="2"/>
-      <w:sz w:val="56"/>
-      <w:szCs w:val="56"/>
-    </w:rPr>
-  </w:style>
-  <w:style w:type="paragraph" w:styleId="Subtitle">
-    <w:name w:val="Subtitle"/>
-    <w:basedOn w:val="Normal"/>
-    <w:next w:val="Normal"/>
-    <w:link w:val="SubtitleChar"/>
-    <w:uiPriority w:val="11"/>
-    <w:qFormat/>
-    <w:rsid w:val="007c036e"/>
-    <w:pPr/>
-    <w:rPr>
-      <w:rFonts w:eastAsia="" w:cs="" w:cstheme="majorBidi" w:eastAsiaTheme="majorEastAsia"/>
-      <w:color w:themeColor="text1" w:themeTint="a6" w:val="595959"/>
-      <w:spacing w:val="15"/>
-      <w:sz w:val="28"/>
-      <w:szCs w:val="28"/>
-    </w:rPr>
-  </w:style>
-  <w:style w:type="paragraph" w:styleId="Quote">
-    <w:name w:val="Quote"/>
-    <w:basedOn w:val="Normal"/>
-    <w:next w:val="Normal"/>
-    <w:link w:val="QuoteChar"/>
-    <w:uiPriority w:val="29"/>
-    <w:qFormat/>
-    <w:rsid w:val="007c036e"/>
-    <w:pPr>
-      <w:spacing w:before="160" w:after="160"/>
-      <w:jc w:val="center"/>
-    </w:pPr>
-    <w:rPr>
-      <w:i/>
-      <w:iCs/>
-      <w:color w:themeColor="text1" w:themeTint="bf" w:val="404040"/>
-    </w:rPr>
-  </w:style>
-  <w:style w:type="paragraph" w:styleId="ListParagraph">
-    <w:name w:val="List Paragraph"/>
-    <w:basedOn w:val="Normal"/>
-    <w:uiPriority w:val="34"/>
-    <w:qFormat/>
-    <w:rsid w:val="007c036e"/>
-    <w:pPr>
-      <w:spacing w:before="0" w:after="160"/>
-      <w:ind w:start="720"/>
-      <w:contextualSpacing/>
-    </w:pPr>
-    <w:rPr/>
-  </w:style>
-  <w:style w:type="paragraph" w:styleId="IntenseQuote">
-    <w:name w:val="Intense Quote"/>
-    <w:basedOn w:val="Normal"/>
-    <w:next w:val="Normal"/>
-    <w:link w:val="IntenseQuoteChar"/>
-    <w:uiPriority w:val="30"/>
-    <w:qFormat/>
-    <w:rsid w:val="007c036e"/>
-    <w:pPr>
-      <w:pBdr>
-        <w:top w:val="single" w:sz="4" w:space="10" w:color="2F5496" w:themeColor="accent1" w:themeShade="bf"/>
-        <w:bottom w:val="single" w:sz="4" w:space="10" w:color="2F5496" w:themeColor="accent1" w:themeShade="bf"/>
-      </w:pBdr>
-      <w:spacing w:before="360" w:after="360"/>
-      <w:ind w:start="864" w:end="864"/>
-      <w:jc w:val="center"/>
-    </w:pPr>
-    <w:rPr>
-      <w:i/>
-      <w:iCs/>
-      <w:color w:themeColor="accent1" w:themeShade="bf" w:val="2F5496"/>
-    </w:rPr>
-  </w:style>
-  <w:style w:type="numbering" w:styleId="NoList" w:default="1">
-    <w:name w:val="No List"/>
-    <w:uiPriority w:val="99"/>
-    <w:semiHidden/>
-    <w:unhideWhenUsed/>
-    <w:qFormat/>
   </w:style>
   <w:style w:type="table" w:default="1" w:styleId="TableNormal">
     <w:name w:val="Normal Table"/>
@@ -1495,6 +1226,7 @@
     <w:semiHidden/>
     <w:unhideWhenUsed/>
     <w:tblPr>
+      <w:tblInd w:w="0" w:type="dxa"/>
       <w:tblCellMar>
         <w:top w:w="0" w:type="dxa"/>
         <w:left w:w="108" w:type="dxa"/>
@@ -1503,11 +1235,368 @@
       </w:tblCellMar>
     </w:tblPr>
   </w:style>
+  <w:style w:type="numbering" w:default="1" w:styleId="NoList">
+    <w:name w:val="No List"/>
+    <w:uiPriority w:val="99"/>
+    <w:semiHidden/>
+    <w:unhideWhenUsed/>
+  </w:style>
+  <w:style w:type="character" w:customStyle="1" w:styleId="Heading1Char">
+    <w:name w:val="Heading 1 Char"/>
+    <w:basedOn w:val="DefaultParagraphFont"/>
+    <w:link w:val="Heading1"/>
+    <w:uiPriority w:val="9"/>
+    <w:qFormat/>
+    <w:rsid w:val="007C036E"/>
+    <w:rPr>
+      <w:rFonts w:asciiTheme="majorHAnsi" w:eastAsiaTheme="majorEastAsia" w:hAnsiTheme="majorHAnsi" w:cstheme="majorBidi"/>
+      <w:color w:val="2F5496" w:themeColor="accent1" w:themeShade="BF"/>
+      <w:sz w:val="40"/>
+      <w:szCs w:val="40"/>
+    </w:rPr>
+  </w:style>
+  <w:style w:type="character" w:customStyle="1" w:styleId="Heading2Char">
+    <w:name w:val="Heading 2 Char"/>
+    <w:basedOn w:val="DefaultParagraphFont"/>
+    <w:link w:val="Heading2"/>
+    <w:uiPriority w:val="9"/>
+    <w:semiHidden/>
+    <w:qFormat/>
+    <w:rsid w:val="007C036E"/>
+    <w:rPr>
+      <w:rFonts w:asciiTheme="majorHAnsi" w:eastAsiaTheme="majorEastAsia" w:hAnsiTheme="majorHAnsi" w:cstheme="majorBidi"/>
+      <w:color w:val="2F5496" w:themeColor="accent1" w:themeShade="BF"/>
+      <w:sz w:val="32"/>
+      <w:szCs w:val="32"/>
+    </w:rPr>
+  </w:style>
+  <w:style w:type="character" w:customStyle="1" w:styleId="Heading3Char">
+    <w:name w:val="Heading 3 Char"/>
+    <w:basedOn w:val="DefaultParagraphFont"/>
+    <w:link w:val="Heading3"/>
+    <w:uiPriority w:val="9"/>
+    <w:semiHidden/>
+    <w:qFormat/>
+    <w:rsid w:val="007C036E"/>
+    <w:rPr>
+      <w:rFonts w:eastAsiaTheme="majorEastAsia" w:cstheme="majorBidi"/>
+      <w:color w:val="2F5496" w:themeColor="accent1" w:themeShade="BF"/>
+      <w:sz w:val="28"/>
+      <w:szCs w:val="28"/>
+    </w:rPr>
+  </w:style>
+  <w:style w:type="character" w:customStyle="1" w:styleId="Heading4Char">
+    <w:name w:val="Heading 4 Char"/>
+    <w:basedOn w:val="DefaultParagraphFont"/>
+    <w:link w:val="Heading4"/>
+    <w:uiPriority w:val="9"/>
+    <w:semiHidden/>
+    <w:qFormat/>
+    <w:rsid w:val="007C036E"/>
+    <w:rPr>
+      <w:rFonts w:eastAsiaTheme="majorEastAsia" w:cstheme="majorBidi"/>
+      <w:i/>
+      <w:iCs/>
+      <w:color w:val="2F5496" w:themeColor="accent1" w:themeShade="BF"/>
+    </w:rPr>
+  </w:style>
+  <w:style w:type="character" w:customStyle="1" w:styleId="Heading5Char">
+    <w:name w:val="Heading 5 Char"/>
+    <w:basedOn w:val="DefaultParagraphFont"/>
+    <w:link w:val="Heading5"/>
+    <w:uiPriority w:val="9"/>
+    <w:semiHidden/>
+    <w:qFormat/>
+    <w:rsid w:val="007C036E"/>
+    <w:rPr>
+      <w:rFonts w:eastAsiaTheme="majorEastAsia" w:cstheme="majorBidi"/>
+      <w:color w:val="2F5496" w:themeColor="accent1" w:themeShade="BF"/>
+    </w:rPr>
+  </w:style>
+  <w:style w:type="character" w:customStyle="1" w:styleId="Heading6Char">
+    <w:name w:val="Heading 6 Char"/>
+    <w:basedOn w:val="DefaultParagraphFont"/>
+    <w:link w:val="Heading6"/>
+    <w:uiPriority w:val="9"/>
+    <w:semiHidden/>
+    <w:qFormat/>
+    <w:rsid w:val="007C036E"/>
+    <w:rPr>
+      <w:rFonts w:eastAsiaTheme="majorEastAsia" w:cstheme="majorBidi"/>
+      <w:i/>
+      <w:iCs/>
+      <w:color w:val="595959" w:themeColor="text1" w:themeTint="A6"/>
+    </w:rPr>
+  </w:style>
+  <w:style w:type="character" w:customStyle="1" w:styleId="Heading7Char">
+    <w:name w:val="Heading 7 Char"/>
+    <w:basedOn w:val="DefaultParagraphFont"/>
+    <w:link w:val="Heading7"/>
+    <w:uiPriority w:val="9"/>
+    <w:semiHidden/>
+    <w:qFormat/>
+    <w:rsid w:val="007C036E"/>
+    <w:rPr>
+      <w:rFonts w:eastAsiaTheme="majorEastAsia" w:cstheme="majorBidi"/>
+      <w:color w:val="595959" w:themeColor="text1" w:themeTint="A6"/>
+    </w:rPr>
+  </w:style>
+  <w:style w:type="character" w:customStyle="1" w:styleId="Heading8Char">
+    <w:name w:val="Heading 8 Char"/>
+    <w:basedOn w:val="DefaultParagraphFont"/>
+    <w:link w:val="Heading8"/>
+    <w:uiPriority w:val="9"/>
+    <w:semiHidden/>
+    <w:qFormat/>
+    <w:rsid w:val="007C036E"/>
+    <w:rPr>
+      <w:rFonts w:eastAsiaTheme="majorEastAsia" w:cstheme="majorBidi"/>
+      <w:i/>
+      <w:iCs/>
+      <w:color w:val="272727" w:themeColor="text1" w:themeTint="D8"/>
+    </w:rPr>
+  </w:style>
+  <w:style w:type="character" w:customStyle="1" w:styleId="Heading9Char">
+    <w:name w:val="Heading 9 Char"/>
+    <w:basedOn w:val="DefaultParagraphFont"/>
+    <w:link w:val="Heading9"/>
+    <w:uiPriority w:val="9"/>
+    <w:semiHidden/>
+    <w:qFormat/>
+    <w:rsid w:val="007C036E"/>
+    <w:rPr>
+      <w:rFonts w:eastAsiaTheme="majorEastAsia" w:cstheme="majorBidi"/>
+      <w:color w:val="272727" w:themeColor="text1" w:themeTint="D8"/>
+    </w:rPr>
+  </w:style>
+  <w:style w:type="character" w:customStyle="1" w:styleId="TitleChar">
+    <w:name w:val="Title Char"/>
+    <w:basedOn w:val="DefaultParagraphFont"/>
+    <w:link w:val="Title"/>
+    <w:uiPriority w:val="10"/>
+    <w:qFormat/>
+    <w:rsid w:val="007C036E"/>
+    <w:rPr>
+      <w:rFonts w:asciiTheme="majorHAnsi" w:eastAsiaTheme="majorEastAsia" w:hAnsiTheme="majorHAnsi" w:cstheme="majorBidi"/>
+      <w:spacing w:val="-10"/>
+      <w:kern w:val="2"/>
+      <w:sz w:val="56"/>
+      <w:szCs w:val="56"/>
+    </w:rPr>
+  </w:style>
+  <w:style w:type="character" w:customStyle="1" w:styleId="SubtitleChar">
+    <w:name w:val="Subtitle Char"/>
+    <w:basedOn w:val="DefaultParagraphFont"/>
+    <w:link w:val="Subtitle"/>
+    <w:uiPriority w:val="11"/>
+    <w:qFormat/>
+    <w:rsid w:val="007C036E"/>
+    <w:rPr>
+      <w:rFonts w:eastAsiaTheme="majorEastAsia" w:cstheme="majorBidi"/>
+      <w:color w:val="595959" w:themeColor="text1" w:themeTint="A6"/>
+      <w:spacing w:val="15"/>
+      <w:sz w:val="28"/>
+      <w:szCs w:val="28"/>
+    </w:rPr>
+  </w:style>
+  <w:style w:type="character" w:customStyle="1" w:styleId="QuoteChar">
+    <w:name w:val="Quote Char"/>
+    <w:basedOn w:val="DefaultParagraphFont"/>
+    <w:link w:val="Quote"/>
+    <w:uiPriority w:val="29"/>
+    <w:qFormat/>
+    <w:rsid w:val="007C036E"/>
+    <w:rPr>
+      <w:i/>
+      <w:iCs/>
+      <w:color w:val="404040" w:themeColor="text1" w:themeTint="BF"/>
+    </w:rPr>
+  </w:style>
+  <w:style w:type="character" w:styleId="IntenseEmphasis">
+    <w:name w:val="Intense Emphasis"/>
+    <w:basedOn w:val="DefaultParagraphFont"/>
+    <w:uiPriority w:val="21"/>
+    <w:qFormat/>
+    <w:rsid w:val="007C036E"/>
+    <w:rPr>
+      <w:i/>
+      <w:iCs/>
+      <w:color w:val="2F5496" w:themeColor="accent1" w:themeShade="BF"/>
+    </w:rPr>
+  </w:style>
+  <w:style w:type="character" w:customStyle="1" w:styleId="IntenseQuoteChar">
+    <w:name w:val="Intense Quote Char"/>
+    <w:basedOn w:val="DefaultParagraphFont"/>
+    <w:link w:val="IntenseQuote"/>
+    <w:uiPriority w:val="30"/>
+    <w:qFormat/>
+    <w:rsid w:val="007C036E"/>
+    <w:rPr>
+      <w:i/>
+      <w:iCs/>
+      <w:color w:val="2F5496" w:themeColor="accent1" w:themeShade="BF"/>
+    </w:rPr>
+  </w:style>
+  <w:style w:type="character" w:styleId="IntenseReference">
+    <w:name w:val="Intense Reference"/>
+    <w:basedOn w:val="DefaultParagraphFont"/>
+    <w:uiPriority w:val="32"/>
+    <w:qFormat/>
+    <w:rsid w:val="007C036E"/>
+    <w:rPr>
+      <w:b/>
+      <w:bCs/>
+      <w:smallCaps/>
+      <w:color w:val="2F5496" w:themeColor="accent1" w:themeShade="BF"/>
+      <w:spacing w:val="5"/>
+    </w:rPr>
+  </w:style>
+  <w:style w:type="paragraph" w:customStyle="1" w:styleId="Heading">
+    <w:name w:val="Heading"/>
+    <w:basedOn w:val="Normal"/>
+    <w:next w:val="BodyText"/>
+    <w:qFormat/>
+    <w:pPr>
+      <w:keepNext/>
+      <w:spacing w:before="240" w:after="120"/>
+    </w:pPr>
+    <w:rPr>
+      <w:rFonts w:ascii="Liberation Sans" w:eastAsia="PingFang SC" w:hAnsi="Liberation Sans" w:cs="Arial Unicode MS"/>
+      <w:sz w:val="28"/>
+      <w:szCs w:val="28"/>
+    </w:rPr>
+  </w:style>
+  <w:style w:type="paragraph" w:styleId="BodyText">
+    <w:name w:val="Body Text"/>
+    <w:basedOn w:val="Normal"/>
+    <w:pPr>
+      <w:spacing w:after="140" w:line="276" w:lineRule="auto"/>
+    </w:pPr>
+  </w:style>
+  <w:style w:type="paragraph" w:styleId="List">
+    <w:name w:val="List"/>
+    <w:basedOn w:val="BodyText"/>
+    <w:rPr>
+      <w:rFonts w:cs="Arial Unicode MS"/>
+    </w:rPr>
+  </w:style>
+  <w:style w:type="paragraph" w:styleId="Caption">
+    <w:name w:val="caption"/>
+    <w:basedOn w:val="Normal"/>
+    <w:qFormat/>
+    <w:pPr>
+      <w:suppressLineNumbers/>
+      <w:spacing w:before="120" w:after="120"/>
+    </w:pPr>
+    <w:rPr>
+      <w:rFonts w:cs="Arial Unicode MS"/>
+      <w:i/>
+      <w:iCs/>
+    </w:rPr>
+  </w:style>
+  <w:style w:type="paragraph" w:customStyle="1" w:styleId="Index">
+    <w:name w:val="Index"/>
+    <w:basedOn w:val="Normal"/>
+    <w:qFormat/>
+    <w:pPr>
+      <w:suppressLineNumbers/>
+    </w:pPr>
+    <w:rPr>
+      <w:rFonts w:cs="Arial Unicode MS"/>
+    </w:rPr>
+  </w:style>
+  <w:style w:type="paragraph" w:styleId="Title">
+    <w:name w:val="Title"/>
+    <w:basedOn w:val="Normal"/>
+    <w:next w:val="Normal"/>
+    <w:link w:val="TitleChar"/>
+    <w:uiPriority w:val="10"/>
+    <w:qFormat/>
+    <w:rsid w:val="007C036E"/>
+    <w:pPr>
+      <w:spacing w:after="80" w:line="240" w:lineRule="auto"/>
+      <w:contextualSpacing/>
+    </w:pPr>
+    <w:rPr>
+      <w:rFonts w:asciiTheme="majorHAnsi" w:eastAsiaTheme="majorEastAsia" w:hAnsiTheme="majorHAnsi" w:cstheme="majorBidi"/>
+      <w:spacing w:val="-10"/>
+      <w:sz w:val="56"/>
+      <w:szCs w:val="56"/>
+    </w:rPr>
+  </w:style>
+  <w:style w:type="paragraph" w:styleId="Subtitle">
+    <w:name w:val="Subtitle"/>
+    <w:basedOn w:val="Normal"/>
+    <w:next w:val="Normal"/>
+    <w:link w:val="SubtitleChar"/>
+    <w:uiPriority w:val="11"/>
+    <w:qFormat/>
+    <w:rsid w:val="007C036E"/>
+    <w:rPr>
+      <w:rFonts w:eastAsiaTheme="majorEastAsia" w:cstheme="majorBidi"/>
+      <w:color w:val="595959" w:themeColor="text1" w:themeTint="A6"/>
+      <w:spacing w:val="15"/>
+      <w:sz w:val="28"/>
+      <w:szCs w:val="28"/>
+    </w:rPr>
+  </w:style>
+  <w:style w:type="paragraph" w:styleId="Quote">
+    <w:name w:val="Quote"/>
+    <w:basedOn w:val="Normal"/>
+    <w:next w:val="Normal"/>
+    <w:link w:val="QuoteChar"/>
+    <w:uiPriority w:val="29"/>
+    <w:qFormat/>
+    <w:rsid w:val="007C036E"/>
+    <w:pPr>
+      <w:spacing w:before="160"/>
+      <w:jc w:val="center"/>
+    </w:pPr>
+    <w:rPr>
+      <w:i/>
+      <w:iCs/>
+      <w:color w:val="404040" w:themeColor="text1" w:themeTint="BF"/>
+    </w:rPr>
+  </w:style>
+  <w:style w:type="paragraph" w:styleId="ListParagraph">
+    <w:name w:val="List Paragraph"/>
+    <w:basedOn w:val="Normal"/>
+    <w:uiPriority w:val="34"/>
+    <w:qFormat/>
+    <w:rsid w:val="007C036E"/>
+    <w:pPr>
+      <w:ind w:left="720"/>
+      <w:contextualSpacing/>
+    </w:pPr>
+  </w:style>
+  <w:style w:type="paragraph" w:styleId="IntenseQuote">
+    <w:name w:val="Intense Quote"/>
+    <w:basedOn w:val="Normal"/>
+    <w:next w:val="Normal"/>
+    <w:link w:val="IntenseQuoteChar"/>
+    <w:uiPriority w:val="30"/>
+    <w:qFormat/>
+    <w:rsid w:val="007C036E"/>
+    <w:pPr>
+      <w:pBdr>
+        <w:top w:val="single" w:sz="4" w:space="10" w:color="2F5496" w:themeColor="accent1" w:themeShade="BF"/>
+        <w:bottom w:val="single" w:sz="4" w:space="10" w:color="2F5496" w:themeColor="accent1" w:themeShade="BF"/>
+      </w:pBdr>
+      <w:spacing w:before="360" w:after="360"/>
+      <w:ind w:left="864" w:right="864"/>
+      <w:jc w:val="center"/>
+    </w:pPr>
+    <w:rPr>
+      <w:i/>
+      <w:iCs/>
+      <w:color w:val="2F5496" w:themeColor="accent1" w:themeShade="BF"/>
+    </w:rPr>
+  </w:style>
 </w:styles>
 </file>
 
 <file path=word/theme/theme1.xml><?xml version="1.0" encoding="utf-8"?>
-<a:theme xmlns:a="http://schemas.openxmlformats.org/drawingml/2006/main" xmlns:r="http://schemas.openxmlformats.org/officeDocument/2006/relationships" name="Office Theme">
+<a:theme xmlns:a="http://schemas.openxmlformats.org/drawingml/2006/main" name="Office Theme">
   <a:themeElements>
     <a:clrScheme name="Office">
       <a:dk1>
@@ -1549,12 +1638,12 @@
     </a:clrScheme>
     <a:fontScheme name="Office">
       <a:majorFont>
-        <a:latin typeface="Calibri Light" panose="020F0302020204030204" pitchFamily="0" charset="1"/>
+        <a:latin typeface="Calibri Light" panose="020F0302020204030204"/>
         <a:ea typeface=""/>
         <a:cs typeface=""/>
       </a:majorFont>
       <a:minorFont>
-        <a:latin typeface="Calibri" panose="020F0502020204030204" pitchFamily="0" charset="1"/>
+        <a:latin typeface="Calibri" panose="020F0502020204030204"/>
         <a:ea typeface=""/>
         <a:cs typeface=""/>
       </a:minorFont>
@@ -1586,7 +1675,7 @@
             </a:gs>
           </a:gsLst>
           <a:lin ang="5400000" scaled="0"/>
-          <a:tileRect l="0" t="0" r="0" b="0"/>
+          <a:tileRect/>
         </a:gradFill>
         <a:gradFill>
           <a:gsLst>
@@ -1610,7 +1699,7 @@
             </a:gs>
           </a:gsLst>
           <a:lin ang="5400000" scaled="0"/>
-          <a:tileRect l="0" t="0" r="0" b="0"/>
+          <a:tileRect/>
         </a:gradFill>
       </a:fillStyleLst>
       <a:lnStyleLst>
@@ -1670,11 +1759,13 @@
             </a:gs>
           </a:gsLst>
           <a:lin ang="5400000" scaled="0"/>
-          <a:tileRect l="0" t="0" r="0" b="0"/>
+          <a:tileRect/>
         </a:gradFill>
       </a:bgFillStyleLst>
     </a:fmtScheme>
   </a:themeElements>
+  <a:objectDefaults/>
+  <a:extraClrSchemeLst/>
 </a:theme>
 </file>
 

</xml_diff>